<commit_message>
Actualizacion del Informe de Factibilidad #16
</commit_message>
<xml_diff>
--- a/FD01-EPIS-Informe de Factibilidad.docx
+++ b/FD01-EPIS-Informe de Factibilidad.docx
@@ -20,7 +20,7 @@
           <w:noProof/>
         </w:rPr>
         <w:drawing>
-          <wp:inline distT="0" distB="0" distL="0" distR="0" wp14:anchorId="249D781F" wp14:editId="48160AE3">
+          <wp:inline distT="0" distB="0" distL="0" distR="0" wp14:anchorId="2E09E0C5" wp14:editId="4C009FB6">
             <wp:extent cx="994867" cy="1337361"/>
             <wp:effectExtent l="0" t="0" r="0" b="0"/>
             <wp:docPr id="1" name="image1.png" descr="C:\Users\EPIS\Documents\upt.png"/>
@@ -386,7 +386,7 @@
           <w:sz w:val="28"/>
           <w:szCs w:val="28"/>
         </w:rPr>
-        <w:t>Hurtado Ortiz, Leandro</w:t>
+        <w:t>Hurtado Ortiz, Leandro Diego</w:t>
       </w:r>
       <w:r>
         <w:rPr>
@@ -398,7 +398,7 @@
           <w:sz w:val="28"/>
           <w:szCs w:val="28"/>
         </w:rPr>
-        <w:t xml:space="preserve"> Diego</w:t>
+        <w:tab/>
       </w:r>
       <w:r>
         <w:rPr>
@@ -411,8 +411,12 @@
           <w:szCs w:val="28"/>
         </w:rPr>
         <w:tab/>
-      </w:r>
-      <w:r>
+        <w:t>(2015052384)</w:t>
+      </w:r>
+    </w:p>
+    <w:p>
+      <w:pPr>
+        <w:spacing w:after="0"/>
         <w:rPr>
           <w:rFonts w:ascii="Arial" w:eastAsia="Arial" w:hAnsi="Arial" w:cs="Arial"/>
           <w:b/>
@@ -422,8 +426,7 @@
           <w:sz w:val="28"/>
           <w:szCs w:val="28"/>
         </w:rPr>
-        <w:tab/>
-      </w:r>
+      </w:pPr>
       <w:r>
         <w:rPr>
           <w:rFonts w:ascii="Arial" w:eastAsia="Arial" w:hAnsi="Arial" w:cs="Arial"/>
@@ -434,12 +437,9 @@
           <w:sz w:val="28"/>
           <w:szCs w:val="28"/>
         </w:rPr>
-        <w:t>(2015052384)</w:t>
-      </w:r>
-    </w:p>
-    <w:p>
-      <w:pPr>
-        <w:spacing w:after="0"/>
+        <w:t>Flores Navarro, Eduardo Gino</w:t>
+      </w:r>
+      <w:r>
         <w:rPr>
           <w:rFonts w:ascii="Arial" w:eastAsia="Arial" w:hAnsi="Arial" w:cs="Arial"/>
           <w:b/>
@@ -449,7 +449,8 @@
           <w:sz w:val="28"/>
           <w:szCs w:val="28"/>
         </w:rPr>
-      </w:pPr>
+        <w:tab/>
+      </w:r>
       <w:r>
         <w:rPr>
           <w:rFonts w:ascii="Arial" w:eastAsia="Arial" w:hAnsi="Arial" w:cs="Arial"/>
@@ -460,9 +461,13 @@
           <w:sz w:val="28"/>
           <w:szCs w:val="28"/>
         </w:rPr>
-        <w:t>Flores Navarro, Eduardo Gino</w:t>
-      </w:r>
-      <w:r>
+        <w:tab/>
+        <w:t>(2023076793)</w:t>
+      </w:r>
+    </w:p>
+    <w:p>
+      <w:pPr>
+        <w:spacing w:after="0"/>
         <w:rPr>
           <w:rFonts w:ascii="Arial" w:eastAsia="Arial" w:hAnsi="Arial" w:cs="Arial"/>
           <w:b/>
@@ -472,8 +477,7 @@
           <w:sz w:val="28"/>
           <w:szCs w:val="28"/>
         </w:rPr>
-        <w:tab/>
-      </w:r>
+      </w:pPr>
       <w:r>
         <w:rPr>
           <w:rFonts w:ascii="Arial" w:eastAsia="Arial" w:hAnsi="Arial" w:cs="Arial"/>
@@ -484,13 +488,9 @@
           <w:sz w:val="28"/>
           <w:szCs w:val="28"/>
         </w:rPr>
-        <w:tab/>
-        <w:t>(2023076793)</w:t>
-      </w:r>
-    </w:p>
-    <w:p>
-      <w:pPr>
-        <w:spacing w:after="0"/>
+        <w:t>Cortez Mamani, Julio Samuel</w:t>
+      </w:r>
+      <w:r>
         <w:rPr>
           <w:rFonts w:ascii="Arial" w:eastAsia="Arial" w:hAnsi="Arial" w:cs="Arial"/>
           <w:b/>
@@ -500,7 +500,8 @@
           <w:sz w:val="28"/>
           <w:szCs w:val="28"/>
         </w:rPr>
-      </w:pPr>
+        <w:tab/>
+      </w:r>
       <w:r>
         <w:rPr>
           <w:rFonts w:ascii="Arial" w:eastAsia="Arial" w:hAnsi="Arial" w:cs="Arial"/>
@@ -511,30 +512,6 @@
           <w:sz w:val="28"/>
           <w:szCs w:val="28"/>
         </w:rPr>
-        <w:t>Cortez Mamani, Julio Samuel</w:t>
-      </w:r>
-      <w:r>
-        <w:rPr>
-          <w:rFonts w:ascii="Arial" w:eastAsia="Arial" w:hAnsi="Arial" w:cs="Arial"/>
-          <w:b/>
-          <w:bCs/>
-          <w:i/>
-          <w:iCs/>
-          <w:sz w:val="28"/>
-          <w:szCs w:val="28"/>
-        </w:rPr>
-        <w:tab/>
-      </w:r>
-      <w:r>
-        <w:rPr>
-          <w:rFonts w:ascii="Arial" w:eastAsia="Arial" w:hAnsi="Arial" w:cs="Arial"/>
-          <w:b/>
-          <w:bCs/>
-          <w:i/>
-          <w:iCs/>
-          <w:sz w:val="28"/>
-          <w:szCs w:val="28"/>
-        </w:rPr>
         <w:tab/>
         <w:t>(2023077283)</w:t>
       </w:r>
@@ -877,7 +854,7 @@
           <w:sz w:val="28"/>
           <w:szCs w:val="28"/>
         </w:rPr>
-        <w:t>3</w:t>
+        <w:t>4</w:t>
       </w:r>
       <w:r>
         <w:rPr>
@@ -1576,14 +1553,7 @@
                 <w:sz w:val="14"/>
                 <w:szCs w:val="14"/>
               </w:rPr>
-              <w:t>3</w:t>
-            </w:r>
-            <w:r>
-              <w:rPr>
-                <w:sz w:val="14"/>
-                <w:szCs w:val="14"/>
-              </w:rPr>
-              <w:t>.0</w:t>
+              <w:t>3.0</w:t>
             </w:r>
           </w:p>
         </w:tc>
@@ -1695,6 +1665,140 @@
           </w:p>
         </w:tc>
       </w:tr>
+      <w:tr>
+        <w:trPr>
+          <w:trHeight w:val="227"/>
+          <w:jc w:val="center"/>
+        </w:trPr>
+        <w:tc>
+          <w:tcPr>
+            <w:tcW w:w="921" w:type="dxa"/>
+          </w:tcPr>
+          <w:p>
+            <w:pPr>
+              <w:jc w:val="center"/>
+              <w:rPr>
+                <w:sz w:val="14"/>
+                <w:szCs w:val="14"/>
+              </w:rPr>
+            </w:pPr>
+            <w:r>
+              <w:rPr>
+                <w:sz w:val="14"/>
+                <w:szCs w:val="14"/>
+              </w:rPr>
+              <w:t>4.0</w:t>
+            </w:r>
+          </w:p>
+        </w:tc>
+        <w:tc>
+          <w:tcPr>
+            <w:tcW w:w="1134" w:type="dxa"/>
+          </w:tcPr>
+          <w:p>
+            <w:pPr>
+              <w:jc w:val="center"/>
+              <w:rPr>
+                <w:sz w:val="14"/>
+                <w:szCs w:val="14"/>
+              </w:rPr>
+            </w:pPr>
+            <w:r>
+              <w:rPr>
+                <w:sz w:val="14"/>
+                <w:szCs w:val="14"/>
+              </w:rPr>
+              <w:t>LDHO</w:t>
+            </w:r>
+          </w:p>
+        </w:tc>
+        <w:tc>
+          <w:tcPr>
+            <w:tcW w:w="1424" w:type="dxa"/>
+          </w:tcPr>
+          <w:p>
+            <w:pPr>
+              <w:jc w:val="center"/>
+              <w:rPr>
+                <w:sz w:val="14"/>
+                <w:szCs w:val="14"/>
+              </w:rPr>
+            </w:pPr>
+            <w:r>
+              <w:rPr>
+                <w:sz w:val="14"/>
+                <w:szCs w:val="14"/>
+              </w:rPr>
+              <w:t>LDHO</w:t>
+            </w:r>
+          </w:p>
+        </w:tc>
+        <w:tc>
+          <w:tcPr>
+            <w:tcW w:w="1482" w:type="dxa"/>
+          </w:tcPr>
+          <w:p>
+            <w:pPr>
+              <w:jc w:val="center"/>
+              <w:rPr>
+                <w:sz w:val="14"/>
+                <w:szCs w:val="14"/>
+              </w:rPr>
+            </w:pPr>
+            <w:r>
+              <w:rPr>
+                <w:sz w:val="14"/>
+                <w:szCs w:val="14"/>
+              </w:rPr>
+              <w:t>LDHO</w:t>
+            </w:r>
+          </w:p>
+        </w:tc>
+        <w:tc>
+          <w:tcPr>
+            <w:tcW w:w="992" w:type="dxa"/>
+            <w:vAlign w:val="center"/>
+          </w:tcPr>
+          <w:p>
+            <w:pPr>
+              <w:jc w:val="center"/>
+              <w:rPr>
+                <w:sz w:val="14"/>
+                <w:szCs w:val="14"/>
+              </w:rPr>
+            </w:pPr>
+            <w:r>
+              <w:rPr>
+                <w:sz w:val="14"/>
+                <w:szCs w:val="14"/>
+              </w:rPr>
+              <w:t>22/06/2026</w:t>
+            </w:r>
+          </w:p>
+        </w:tc>
+        <w:tc>
+          <w:tcPr>
+            <w:tcW w:w="3058" w:type="dxa"/>
+            <w:shd w:val="clear" w:color="auto" w:fill="auto"/>
+            <w:vAlign w:val="center"/>
+          </w:tcPr>
+          <w:p>
+            <w:pPr>
+              <w:rPr>
+                <w:sz w:val="14"/>
+                <w:szCs w:val="14"/>
+              </w:rPr>
+            </w:pPr>
+            <w:r>
+              <w:rPr>
+                <w:sz w:val="14"/>
+                <w:szCs w:val="14"/>
+              </w:rPr>
+              <w:t>Versión 4.0</w:t>
+            </w:r>
+          </w:p>
+        </w:tc>
+      </w:tr>
     </w:tbl>
     <w:p>
       <w:pPr>
@@ -1756,7 +1860,7 @@
     </w:p>
     <w:sdt>
       <w:sdtPr>
-        <w:id w:val="287801380"/>
+        <w:id w:val="-1340173157"/>
         <w:docPartObj>
           <w:docPartGallery w:val="Table of Contents"/>
           <w:docPartUnique/>
@@ -2709,17 +2813,6 @@
     </w:p>
     <w:p>
       <w:pPr>
-        <w:rPr>
-          <w:b/>
-          <w:bCs/>
-          <w:sz w:val="24"/>
-          <w:szCs w:val="24"/>
-          <w:u w:val="single"/>
-        </w:rPr>
-      </w:pPr>
-    </w:p>
-    <w:p>
-      <w:pPr>
         <w:jc w:val="center"/>
         <w:rPr>
           <w:b/>
@@ -2778,18 +2871,7 @@
           <w:sz w:val="24"/>
           <w:szCs w:val="24"/>
         </w:rPr>
-        <w:t>1</w:t>
-      </w:r>
-      <w:r>
-        <w:rPr>
-          <w:rFonts w:ascii="Times New Roman" w:eastAsia="Times New Roman" w:hAnsi="Times New Roman" w:cs="Times New Roman"/>
-          <w:b/>
-          <w:bCs/>
-          <w:color w:val="000000"/>
-          <w:sz w:val="24"/>
-          <w:szCs w:val="24"/>
-        </w:rPr>
-        <w:t>. Descripción del proyecto</w:t>
+        <w:t>1. Descripción del proyecto</w:t>
       </w:r>
     </w:p>
     <w:p>
@@ -2811,15 +2893,7 @@
           <w:sz w:val="24"/>
           <w:szCs w:val="24"/>
         </w:rPr>
-        <w:t>1</w:t>
-      </w:r>
-      <w:r>
-        <w:rPr>
-          <w:rFonts w:ascii="Times New Roman" w:eastAsia="Times New Roman" w:hAnsi="Times New Roman" w:cs="Times New Roman"/>
-          <w:sz w:val="24"/>
-          <w:szCs w:val="24"/>
-        </w:rPr>
-        <w:t>.1 Nombre del proyecto</w:t>
+        <w:t>1.1 Nombre del proyecto</w:t>
       </w:r>
     </w:p>
     <w:p>
@@ -2870,15 +2944,7 @@
           <w:sz w:val="24"/>
           <w:szCs w:val="24"/>
         </w:rPr>
-        <w:t>1</w:t>
-      </w:r>
-      <w:r>
-        <w:rPr>
-          <w:rFonts w:ascii="Times New Roman" w:eastAsia="Times New Roman" w:hAnsi="Times New Roman" w:cs="Times New Roman"/>
-          <w:sz w:val="24"/>
-          <w:szCs w:val="24"/>
-        </w:rPr>
-        <w:t>.2 Duración del proyecto</w:t>
+        <w:t>1.2 Duración del proyecto</w:t>
       </w:r>
     </w:p>
     <w:p>
@@ -2948,15 +3014,7 @@
           <w:sz w:val="24"/>
           <w:szCs w:val="24"/>
         </w:rPr>
-        <w:t>1</w:t>
-      </w:r>
-      <w:r>
-        <w:rPr>
-          <w:rFonts w:ascii="Times New Roman" w:eastAsia="Times New Roman" w:hAnsi="Times New Roman" w:cs="Times New Roman"/>
-          <w:sz w:val="24"/>
-          <w:szCs w:val="24"/>
-        </w:rPr>
-        <w:t>.3 Descripción</w:t>
+        <w:t>1.3 Descripción</w:t>
       </w:r>
     </w:p>
     <w:p>
@@ -2975,39 +3033,47 @@
           <w:sz w:val="24"/>
           <w:szCs w:val="24"/>
         </w:rPr>
-        <w:t xml:space="preserve">El proyecto consiste en el diseño y desarrollo de una plataforma web de acceso unificado orientada a centralizar y simplificar el descubrimiento de recursos bibliográficos para la comunidad académica de la Universidad Privada de Tacna. El sistema funciona </w:t>
-      </w:r>
-      <w:r>
-        <w:rPr>
-          <w:rFonts w:ascii="Times New Roman" w:eastAsia="Times New Roman" w:hAnsi="Times New Roman" w:cs="Times New Roman"/>
-          <w:sz w:val="24"/>
-          <w:szCs w:val="24"/>
-        </w:rPr>
-        <w:t xml:space="preserve">como un meta-buscador híbrido que integra tres pilares estratégicos: la base de datos local de la biblioteca física de la UPT, el catálogo digital especializado de Alpha Cloud y la extensa colección académica de E-Libro, lo que permite una cobertura mucho </w:t>
-      </w:r>
-      <w:r>
-        <w:rPr>
-          <w:rFonts w:ascii="Times New Roman" w:eastAsia="Times New Roman" w:hAnsi="Times New Roman" w:cs="Times New Roman"/>
-          <w:sz w:val="24"/>
-          <w:szCs w:val="24"/>
-        </w:rPr>
-        <w:t>más amplia y categorizada.  La solución optimiza la investigación académica al proporcionar, en una sola interfaz, la consulta simultánea de la disponibilidad de textos en estanterías físicas y el acceso directo a recursos electrónicos validados de alta ca</w:t>
-      </w:r>
-      <w:r>
-        <w:rPr>
-          <w:rFonts w:ascii="Times New Roman" w:eastAsia="Times New Roman" w:hAnsi="Times New Roman" w:cs="Times New Roman"/>
-          <w:sz w:val="24"/>
-          <w:szCs w:val="24"/>
-        </w:rPr>
-        <w:t xml:space="preserve">lidad. El sistema se basa en una arquitectura de servicios distribuidos que orquesta la recuperación de metadatos desde repositorios institucionales y externos para ofrecer un catálogo enriquecido. Para su implementación, se utiliza el lenguaje PHP 8.2.12 </w:t>
-      </w:r>
-      <w:r>
-        <w:rPr>
-          <w:rFonts w:ascii="Times New Roman" w:eastAsia="Times New Roman" w:hAnsi="Times New Roman" w:cs="Times New Roman"/>
-          <w:sz w:val="24"/>
-          <w:szCs w:val="24"/>
-        </w:rPr>
-        <w:t xml:space="preserve">y MySQL para la persistencia de datos, empleando </w:t>
+        <w:t xml:space="preserve">El proyecto consiste en el diseño y desarrollo de una plataforma web de acceso unificado </w:t>
+      </w:r>
+      <w:r>
+        <w:rPr>
+          <w:rFonts w:ascii="Times New Roman" w:eastAsia="Times New Roman" w:hAnsi="Times New Roman" w:cs="Times New Roman"/>
+          <w:sz w:val="24"/>
+          <w:szCs w:val="24"/>
+        </w:rPr>
+        <w:t>orientada a centralizar y simplificar el descubrimiento de recursos bibliográficos para la comunidad académica de la Universidad Privada de Tacna. El sistema funciona como un meta-buscador híbrido que integra tres pilares estratégicos: la base de datos loc</w:t>
+      </w:r>
+      <w:r>
+        <w:rPr>
+          <w:rFonts w:ascii="Times New Roman" w:eastAsia="Times New Roman" w:hAnsi="Times New Roman" w:cs="Times New Roman"/>
+          <w:sz w:val="24"/>
+          <w:szCs w:val="24"/>
+        </w:rPr>
+        <w:t>al de la biblioteca física de la UPT, el catálogo digital especializado de Alpha Cloud y la extensa colección académica de E-Libro, lo que permite una cobertura mucho más amplia y categorizada. La solución optimiza la investigación académica al proporciona</w:t>
+      </w:r>
+      <w:r>
+        <w:rPr>
+          <w:rFonts w:ascii="Times New Roman" w:eastAsia="Times New Roman" w:hAnsi="Times New Roman" w:cs="Times New Roman"/>
+          <w:sz w:val="24"/>
+          <w:szCs w:val="24"/>
+        </w:rPr>
+        <w:t>r, en una sola interfaz, la consulta simultánea de la disponibilidad de textos en estanterías físicas y el acceso directo a recursos electrónicos validados de alta calidad. El sistema se basa en una arquitectura de servicios distribuidos que orquesta la re</w:t>
+      </w:r>
+      <w:r>
+        <w:rPr>
+          <w:rFonts w:ascii="Times New Roman" w:eastAsia="Times New Roman" w:hAnsi="Times New Roman" w:cs="Times New Roman"/>
+          <w:sz w:val="24"/>
+          <w:szCs w:val="24"/>
+        </w:rPr>
+        <w:t>cuperación de metadatos desde repositorios institucionales y externos para ofrecer un catálogo enriquecido. Para su implementación, se utiliza el lenguaje PHP 8.2.12 y MySQL para la persistencia de datos, desplegados sobre una Máquina Virtual dedicada en M</w:t>
+      </w:r>
+      <w:r>
+        <w:rPr>
+          <w:rFonts w:ascii="Times New Roman" w:eastAsia="Times New Roman" w:hAnsi="Times New Roman" w:cs="Times New Roman"/>
+          <w:sz w:val="24"/>
+          <w:szCs w:val="24"/>
+        </w:rPr>
+        <w:t xml:space="preserve">icrosoft Azure ejecutando el sistema operativo Windows Server 2025 </w:t>
       </w:r>
       <w:proofErr w:type="spellStart"/>
       <w:r>
@@ -3016,7 +3082,7 @@
           <w:sz w:val="24"/>
           <w:szCs w:val="24"/>
         </w:rPr>
-        <w:t>Terraform</w:t>
+        <w:t>Datacenter</w:t>
       </w:r>
       <w:proofErr w:type="spellEnd"/>
       <w:r>
@@ -3025,25 +3091,15 @@
           <w:sz w:val="24"/>
           <w:szCs w:val="24"/>
         </w:rPr>
-        <w:t xml:space="preserve"> para la gestión de infraestructura como código (</w:t>
-      </w:r>
-      <w:proofErr w:type="spellStart"/>
-      <w:r>
-        <w:rPr>
-          <w:rFonts w:ascii="Times New Roman" w:eastAsia="Times New Roman" w:hAnsi="Times New Roman" w:cs="Times New Roman"/>
-          <w:sz w:val="24"/>
-          <w:szCs w:val="24"/>
-        </w:rPr>
-        <w:t>IaC</w:t>
-      </w:r>
-      <w:proofErr w:type="spellEnd"/>
-      <w:r>
-        <w:rPr>
-          <w:rFonts w:ascii="Times New Roman" w:eastAsia="Times New Roman" w:hAnsi="Times New Roman" w:cs="Times New Roman"/>
-          <w:sz w:val="24"/>
-          <w:szCs w:val="24"/>
-        </w:rPr>
-        <w:t>) sobre Microsoft Azure.</w:t>
+        <w:t>. El entorno se administra de manera continua mediante los servicios locales de Apache y MySQL activos en la suite XAMPP, exponiendo la plataforma de forma permanente hacia intern</w:t>
+      </w:r>
+      <w:r>
+        <w:rPr>
+          <w:rFonts w:ascii="Times New Roman" w:eastAsia="Times New Roman" w:hAnsi="Times New Roman" w:cs="Times New Roman"/>
+          <w:sz w:val="24"/>
+          <w:szCs w:val="24"/>
+        </w:rPr>
+        <w:t xml:space="preserve">et a través de una etiqueta DNS pública para garantizar su completa disponibilidad operativa. </w:t>
       </w:r>
     </w:p>
     <w:p>
@@ -3065,15 +3121,7 @@
           <w:sz w:val="24"/>
           <w:szCs w:val="24"/>
         </w:rPr>
-        <w:t>1</w:t>
-      </w:r>
-      <w:r>
-        <w:rPr>
-          <w:rFonts w:ascii="Times New Roman" w:eastAsia="Times New Roman" w:hAnsi="Times New Roman" w:cs="Times New Roman"/>
-          <w:sz w:val="24"/>
-          <w:szCs w:val="24"/>
-        </w:rPr>
-        <w:t>.4 Objetivos</w:t>
+        <w:t>1.4 Objetivos</w:t>
       </w:r>
     </w:p>
     <w:p>
@@ -3095,15 +3143,7 @@
           <w:sz w:val="24"/>
           <w:szCs w:val="24"/>
         </w:rPr>
-        <w:t>1</w:t>
-      </w:r>
-      <w:r>
-        <w:rPr>
-          <w:rFonts w:ascii="Times New Roman" w:eastAsia="Times New Roman" w:hAnsi="Times New Roman" w:cs="Times New Roman"/>
-          <w:sz w:val="24"/>
-          <w:szCs w:val="24"/>
-        </w:rPr>
-        <w:t>.4.1. Objetivo general</w:t>
+        <w:t>1.4.1. Objetivo general</w:t>
       </w:r>
     </w:p>
     <w:p>
@@ -3126,7 +3166,15 @@
           <w:sz w:val="24"/>
           <w:szCs w:val="24"/>
         </w:rPr>
-        <w:t>Desarrollar una plataforma web unificada que optimice la localización y el acceso a recursos bibliográficos físicos y digitales, mejorando la experiencia de búsqueda y la gestión de información para la comunidad académica.</w:t>
+        <w:t>Desarrollar una plataforma web unificada que optimice la localización y el acceso a recursos bibliográficos físicos y digit</w:t>
+      </w:r>
+      <w:r>
+        <w:rPr>
+          <w:rFonts w:ascii="Times New Roman" w:eastAsia="Times New Roman" w:hAnsi="Times New Roman" w:cs="Times New Roman"/>
+          <w:sz w:val="24"/>
+          <w:szCs w:val="24"/>
+        </w:rPr>
+        <w:t>ales, mejorando la experiencia de búsqueda y la gestión de información para la comunidad académica.</w:t>
       </w:r>
     </w:p>
     <w:p>
@@ -3148,15 +3196,8 @@
           <w:sz w:val="24"/>
           <w:szCs w:val="24"/>
         </w:rPr>
-        <w:t>1</w:t>
-      </w:r>
-      <w:r>
-        <w:rPr>
-          <w:rFonts w:ascii="Times New Roman" w:eastAsia="Times New Roman" w:hAnsi="Times New Roman" w:cs="Times New Roman"/>
-          <w:sz w:val="24"/>
-          <w:szCs w:val="24"/>
-        </w:rPr>
-        <w:t>.4.2 Objetivos específicos</w:t>
+        <w:lastRenderedPageBreak/>
+        <w:t>1.4.2 Objetivos específicos</w:t>
       </w:r>
     </w:p>
     <w:p>
@@ -3179,15 +3220,15 @@
           <w:sz w:val="24"/>
           <w:szCs w:val="24"/>
         </w:rPr>
-        <w:t>Diseñ</w:t>
-      </w:r>
-      <w:r>
-        <w:rPr>
-          <w:rFonts w:ascii="Times New Roman" w:eastAsia="Times New Roman" w:hAnsi="Times New Roman" w:cs="Times New Roman"/>
-          <w:sz w:val="24"/>
-          <w:szCs w:val="24"/>
-        </w:rPr>
-        <w:t xml:space="preserve">ar e implementar un sistema de búsqueda multicanal que permita filtrar resultados por título, autor y categoría, unificando la consulta de recursos físicos y virtuales en una sola interfaz.  </w:t>
+        <w:t>Diseñar e implementar un sistema de búsqueda multicanal que permita filtrar resultados por título, autor y categoría, unificando</w:t>
+      </w:r>
+      <w:r>
+        <w:rPr>
+          <w:rFonts w:ascii="Times New Roman" w:eastAsia="Times New Roman" w:hAnsi="Times New Roman" w:cs="Times New Roman"/>
+          <w:sz w:val="24"/>
+          <w:szCs w:val="24"/>
+        </w:rPr>
+        <w:t xml:space="preserve"> la consulta de recursos físicos y virtuales en una sola interfaz.  </w:t>
       </w:r>
     </w:p>
     <w:p>
@@ -3210,16 +3251,7 @@
           <w:sz w:val="24"/>
           <w:szCs w:val="24"/>
         </w:rPr>
-        <w:lastRenderedPageBreak/>
-        <w:t xml:space="preserve">Integrar la base de datos local de la biblioteca de la UPT para </w:t>
-      </w:r>
-      <w:r>
-        <w:rPr>
-          <w:rFonts w:ascii="Times New Roman" w:eastAsia="Times New Roman" w:hAnsi="Times New Roman" w:cs="Times New Roman"/>
-          <w:sz w:val="24"/>
-          <w:szCs w:val="24"/>
-        </w:rPr>
-        <w:t xml:space="preserve">permitir a los usuarios visualizar la disponibilidad de los textos físicos en estantería en tiempo real.  </w:t>
+        <w:t xml:space="preserve">Integrar la base de datos local de la biblioteca de la UPT para permitir a los usuarios visualizar la disponibilidad de los textos físicos en estantería en tiempo real.  </w:t>
       </w:r>
     </w:p>
     <w:p>
@@ -3242,15 +3274,15 @@
           <w:sz w:val="24"/>
           <w:szCs w:val="24"/>
         </w:rPr>
-        <w:t>Vincular los catálogos digitales de Alpha Cloud y E-Libro para expandir significativamente la oferta bibliográfica y garantizar el acceso a una mayor</w:t>
-      </w:r>
-      <w:r>
-        <w:rPr>
-          <w:rFonts w:ascii="Times New Roman" w:eastAsia="Times New Roman" w:hAnsi="Times New Roman" w:cs="Times New Roman"/>
-          <w:sz w:val="24"/>
-          <w:szCs w:val="24"/>
-        </w:rPr>
-        <w:t xml:space="preserve"> variedad de categorías académicas.  </w:t>
+        <w:t>Vincular los cat</w:t>
+      </w:r>
+      <w:r>
+        <w:rPr>
+          <w:rFonts w:ascii="Times New Roman" w:eastAsia="Times New Roman" w:hAnsi="Times New Roman" w:cs="Times New Roman"/>
+          <w:sz w:val="24"/>
+          <w:szCs w:val="24"/>
+        </w:rPr>
+        <w:t xml:space="preserve">álogos digitales de Alpha Cloud y E-Libro para expandir significativamente la oferta bibliográfica y garantizar el acceso a una mayor variedad de categorías académicas.  </w:t>
       </w:r>
     </w:p>
     <w:p>
@@ -3273,43 +3305,15 @@
           <w:sz w:val="24"/>
           <w:szCs w:val="24"/>
         </w:rPr>
-        <w:t>Configurar la infraestructura como código (</w:t>
-      </w:r>
-      <w:proofErr w:type="spellStart"/>
-      <w:r>
-        <w:rPr>
-          <w:rFonts w:ascii="Times New Roman" w:eastAsia="Times New Roman" w:hAnsi="Times New Roman" w:cs="Times New Roman"/>
-          <w:sz w:val="24"/>
-          <w:szCs w:val="24"/>
-        </w:rPr>
-        <w:t>IaC</w:t>
-      </w:r>
-      <w:proofErr w:type="spellEnd"/>
-      <w:r>
-        <w:rPr>
-          <w:rFonts w:ascii="Times New Roman" w:eastAsia="Times New Roman" w:hAnsi="Times New Roman" w:cs="Times New Roman"/>
-          <w:sz w:val="24"/>
-          <w:szCs w:val="24"/>
-        </w:rPr>
-        <w:t xml:space="preserve">) mediante </w:t>
-      </w:r>
-      <w:proofErr w:type="spellStart"/>
-      <w:r>
-        <w:rPr>
-          <w:rFonts w:ascii="Times New Roman" w:eastAsia="Times New Roman" w:hAnsi="Times New Roman" w:cs="Times New Roman"/>
-          <w:sz w:val="24"/>
-          <w:szCs w:val="24"/>
-        </w:rPr>
-        <w:t>Terraform</w:t>
-      </w:r>
-      <w:proofErr w:type="spellEnd"/>
-      <w:r>
-        <w:rPr>
-          <w:rFonts w:ascii="Times New Roman" w:eastAsia="Times New Roman" w:hAnsi="Times New Roman" w:cs="Times New Roman"/>
-          <w:sz w:val="24"/>
-          <w:szCs w:val="24"/>
-        </w:rPr>
-        <w:t xml:space="preserve"> para automatizar el despliegue de los servicios en Microsoft Azure y gestionar con precisión los costos operativos.  </w:t>
+        <w:t>Configurar y optimizar un servidor dedicado en la nube mediante una Máquina Virtual e</w:t>
+      </w:r>
+      <w:r>
+        <w:rPr>
+          <w:rFonts w:ascii="Times New Roman" w:eastAsia="Times New Roman" w:hAnsi="Times New Roman" w:cs="Times New Roman"/>
+          <w:sz w:val="24"/>
+          <w:szCs w:val="24"/>
+        </w:rPr>
+        <w:t>n Microsoft Azure para albergar los servicios web y la persistencia de datos bajo un entorno unificado de alta disponibilidad.</w:t>
       </w:r>
     </w:p>
     <w:p>
@@ -3332,15 +3336,15 @@
           <w:sz w:val="24"/>
           <w:szCs w:val="24"/>
         </w:rPr>
-        <w:t>Garantizar la escalabilidad de la</w:t>
-      </w:r>
-      <w:r>
-        <w:rPr>
-          <w:rFonts w:ascii="Times New Roman" w:eastAsia="Times New Roman" w:hAnsi="Times New Roman" w:cs="Times New Roman"/>
-          <w:sz w:val="24"/>
-          <w:szCs w:val="24"/>
-        </w:rPr>
-        <w:t xml:space="preserve"> arquitectura, facilitando la futura incorporación de bases de datos de otras facultades o repositorios institucionales adicionales. </w:t>
+        <w:t>Garantizar la escalabilidad de la arquitectura, facilitando la futura incorporación de bases de datos de otras facultades o repos</w:t>
+      </w:r>
+      <w:r>
+        <w:rPr>
+          <w:rFonts w:ascii="Times New Roman" w:eastAsia="Times New Roman" w:hAnsi="Times New Roman" w:cs="Times New Roman"/>
+          <w:sz w:val="24"/>
+          <w:szCs w:val="24"/>
+        </w:rPr>
+        <w:t xml:space="preserve">itorios institucionales adicionales. </w:t>
       </w:r>
     </w:p>
     <w:p>
@@ -3368,18 +3372,7 @@
           <w:sz w:val="24"/>
           <w:szCs w:val="24"/>
         </w:rPr>
-        <w:t>2</w:t>
-      </w:r>
-      <w:r>
-        <w:rPr>
-          <w:rFonts w:ascii="Times New Roman" w:eastAsia="Times New Roman" w:hAnsi="Times New Roman" w:cs="Times New Roman"/>
-          <w:b/>
-          <w:bCs/>
-          <w:color w:val="000000"/>
-          <w:sz w:val="24"/>
-          <w:szCs w:val="24"/>
-        </w:rPr>
-        <w:t>. Riesgos</w:t>
+        <w:t>2. Riesgos</w:t>
       </w:r>
     </w:p>
     <w:p>
@@ -3412,15 +3405,7 @@
           <w:sz w:val="24"/>
           <w:szCs w:val="24"/>
         </w:rPr>
-        <w:t xml:space="preserve"> Existe la posibilidad de que la base de datos no refleje en tiempo real</w:t>
-      </w:r>
-      <w:r>
-        <w:rPr>
-          <w:rFonts w:ascii="Times New Roman" w:eastAsia="Times New Roman" w:hAnsi="Times New Roman" w:cs="Times New Roman"/>
-          <w:sz w:val="24"/>
-          <w:szCs w:val="24"/>
-        </w:rPr>
-        <w:t xml:space="preserve"> si un libro físico ha sido tomado de la estantería de la UPT sin ser registrado, lo que generaría desconfianza en el usuario ante datos inexactos.</w:t>
+        <w:t xml:space="preserve"> Existe la posibilidad de que la base de datos no refleje en tiempo real si un libro físico ha sido tomado de la estantería de la UPT sin ser registrado, lo que generaría desconfianza en el usuario ante datos inexactos.</w:t>
       </w:r>
     </w:p>
     <w:p>
@@ -3467,23 +3452,33 @@
           <w:sz w:val="24"/>
           <w:szCs w:val="24"/>
         </w:rPr>
-        <w:t xml:space="preserve"> Externas:</w:t>
-      </w:r>
-      <w:r>
-        <w:rPr>
-          <w:rFonts w:ascii="Times New Roman" w:eastAsia="Times New Roman" w:hAnsi="Times New Roman" w:cs="Times New Roman"/>
-          <w:sz w:val="24"/>
-          <w:szCs w:val="24"/>
-        </w:rPr>
-        <w:t xml:space="preserve"> Al depender de las plataformas Alpha Cloud y E-Libro, el sistema q</w:t>
-      </w:r>
-      <w:r>
-        <w:rPr>
-          <w:rFonts w:ascii="Times New Roman" w:eastAsia="Times New Roman" w:hAnsi="Times New Roman" w:cs="Times New Roman"/>
-          <w:sz w:val="24"/>
-          <w:szCs w:val="24"/>
-        </w:rPr>
-        <w:t>ueda sujeto a la disponibilidad técnica de estos proveedores; cualquier caída en sus servicios o lentitud en sus tiempos de respuesta afectará directamente la experiencia de búsqueda unificada.</w:t>
+        <w:t xml:space="preserve"> Exte</w:t>
+      </w:r>
+      <w:r>
+        <w:rPr>
+          <w:rFonts w:ascii="Times New Roman" w:eastAsia="Times New Roman" w:hAnsi="Times New Roman" w:cs="Times New Roman"/>
+          <w:b/>
+          <w:bCs/>
+          <w:sz w:val="24"/>
+          <w:szCs w:val="24"/>
+        </w:rPr>
+        <w:t>rnas:</w:t>
+      </w:r>
+      <w:r>
+        <w:rPr>
+          <w:rFonts w:ascii="Times New Roman" w:eastAsia="Times New Roman" w:hAnsi="Times New Roman" w:cs="Times New Roman"/>
+          <w:sz w:val="24"/>
+          <w:szCs w:val="24"/>
+        </w:rPr>
+        <w:t xml:space="preserve"> Al depender de las plataformas Alpha Cloud y E-Libro, el sistema queda sujeto a la disponibilidad técnica de estos proveedores; cualquier caída en sus servicios o lentitud en sus tiempos de respuesta afectará directamente la experiencia de búsqueda u</w:t>
+      </w:r>
+      <w:r>
+        <w:rPr>
+          <w:rFonts w:ascii="Times New Roman" w:eastAsia="Times New Roman" w:hAnsi="Times New Roman" w:cs="Times New Roman"/>
+          <w:sz w:val="24"/>
+          <w:szCs w:val="24"/>
+        </w:rPr>
+        <w:t>nificada.</w:t>
       </w:r>
     </w:p>
     <w:p>
@@ -3516,15 +3511,15 @@
           <w:sz w:val="24"/>
           <w:szCs w:val="24"/>
         </w:rPr>
-        <w:t xml:space="preserve"> La integració</w:t>
-      </w:r>
-      <w:r>
-        <w:rPr>
-          <w:rFonts w:ascii="Times New Roman" w:eastAsia="Times New Roman" w:hAnsi="Times New Roman" w:cs="Times New Roman"/>
-          <w:sz w:val="24"/>
-          <w:szCs w:val="24"/>
-        </w:rPr>
-        <w:t>n de tres fuentes distintas (UPT, Alpha Cloud y E-Libro) aumenta el riesgo de encontrar registros duplicados o formatos de metadatos incompatibles, lo que podría complicar la visualización homogénea de los recursos.</w:t>
+        <w:t xml:space="preserve"> La integración de tres fuentes distintas (UPT, Alpha Cloud y E-Libro) aumenta el riesgo de encontrar registros duplicados o formatos de metadatos incompatibles, lo que podría complicar la visualiza</w:t>
+      </w:r>
+      <w:r>
+        <w:rPr>
+          <w:rFonts w:ascii="Times New Roman" w:eastAsia="Times New Roman" w:hAnsi="Times New Roman" w:cs="Times New Roman"/>
+          <w:sz w:val="24"/>
+          <w:szCs w:val="24"/>
+        </w:rPr>
+        <w:t>ción homogénea de los recursos.</w:t>
       </w:r>
     </w:p>
     <w:p>
@@ -3557,15 +3552,15 @@
           <w:sz w:val="24"/>
           <w:szCs w:val="24"/>
         </w:rPr>
-        <w:t xml:space="preserve"> Al ut</w:t>
-      </w:r>
-      <w:r>
-        <w:rPr>
-          <w:rFonts w:ascii="Times New Roman" w:eastAsia="Times New Roman" w:hAnsi="Times New Roman" w:cs="Times New Roman"/>
-          <w:sz w:val="24"/>
-          <w:szCs w:val="24"/>
-        </w:rPr>
-        <w:t>ilizar Microsoft Azure para el despliegue, persiste el riesgo de agotar la cuota de créditos de estudiante antes de completar las pruebas de rendimiento, afectando la disponibilidad operativa a largo plazo.</w:t>
+        <w:t xml:space="preserve"> Al utilizar Microsoft Azure para el despliegue, persiste el riesgo de agotar la cuota de créditos de estudiante antes de completar las pruebas de rendimiento, afectando la disponibilidad op</w:t>
+      </w:r>
+      <w:r>
+        <w:rPr>
+          <w:rFonts w:ascii="Times New Roman" w:eastAsia="Times New Roman" w:hAnsi="Times New Roman" w:cs="Times New Roman"/>
+          <w:sz w:val="24"/>
+          <w:szCs w:val="24"/>
+        </w:rPr>
+        <w:t>erativa a largo plazo.</w:t>
       </w:r>
     </w:p>
     <w:p>
@@ -3590,19 +3585,26 @@
           <w:sz w:val="24"/>
           <w:szCs w:val="24"/>
         </w:rPr>
-        <w:t>Gestión de Infraestructura como Código:</w:t>
-      </w:r>
-      <w:r>
-        <w:rPr>
-          <w:rFonts w:ascii="Times New Roman" w:eastAsia="Times New Roman" w:hAnsi="Times New Roman" w:cs="Times New Roman"/>
-          <w:sz w:val="24"/>
-          <w:szCs w:val="24"/>
-        </w:rPr>
-        <w:t xml:space="preserve"> El uso de</w:t>
-      </w:r>
-      <w:r>
-        <w:rPr>
-          <w:rFonts w:ascii="Times New Roman" w:eastAsia="Times New Roman" w:hAnsi="Times New Roman" w:cs="Times New Roman"/>
+        <w:lastRenderedPageBreak/>
+        <w:t xml:space="preserve">Dependencia de un Punto Único de Fallo (Single Point </w:t>
+      </w:r>
+      <w:proofErr w:type="spellStart"/>
+      <w:r>
+        <w:rPr>
+          <w:rFonts w:ascii="Times New Roman" w:eastAsia="Times New Roman" w:hAnsi="Times New Roman" w:cs="Times New Roman"/>
+          <w:b/>
+          <w:bCs/>
+          <w:sz w:val="24"/>
+          <w:szCs w:val="24"/>
+        </w:rPr>
+        <w:t>of</w:t>
+      </w:r>
+      <w:proofErr w:type="spellEnd"/>
+      <w:r>
+        <w:rPr>
+          <w:rFonts w:ascii="Times New Roman" w:eastAsia="Times New Roman" w:hAnsi="Times New Roman" w:cs="Times New Roman"/>
+          <w:b/>
+          <w:bCs/>
           <w:sz w:val="24"/>
           <w:szCs w:val="24"/>
         </w:rPr>
@@ -3612,19 +3614,93 @@
       <w:r>
         <w:rPr>
           <w:rFonts w:ascii="Times New Roman" w:eastAsia="Times New Roman" w:hAnsi="Times New Roman" w:cs="Times New Roman"/>
-          <w:sz w:val="24"/>
-          <w:szCs w:val="24"/>
-        </w:rPr>
-        <w:t>Terraform</w:t>
+          <w:b/>
+          <w:bCs/>
+          <w:sz w:val="24"/>
+          <w:szCs w:val="24"/>
+        </w:rPr>
+        <w:t>Failure</w:t>
       </w:r>
       <w:proofErr w:type="spellEnd"/>
       <w:r>
         <w:rPr>
           <w:rFonts w:ascii="Times New Roman" w:eastAsia="Times New Roman" w:hAnsi="Times New Roman" w:cs="Times New Roman"/>
-          <w:sz w:val="24"/>
-          <w:szCs w:val="24"/>
-        </w:rPr>
-        <w:t xml:space="preserve"> requiere una configuración extremadamente precisa; errores en los scripts de automatización podrían derivar en fallos en la provisión de recursos en la nube o estimaciones de costos erróneas</w:t>
+          <w:b/>
+          <w:bCs/>
+          <w:sz w:val="24"/>
+          <w:szCs w:val="24"/>
+        </w:rPr>
+        <w:t>):</w:t>
+      </w:r>
+      <w:r>
+        <w:rPr>
+          <w:rFonts w:ascii="Times New Roman" w:eastAsia="Times New Roman" w:hAnsi="Times New Roman" w:cs="Times New Roman"/>
+          <w:sz w:val="24"/>
+          <w:szCs w:val="24"/>
+        </w:rPr>
+        <w:t xml:space="preserve"> Al estar alojados tanto el servidor Apache (</w:t>
+      </w:r>
+      <w:proofErr w:type="spellStart"/>
+      <w:r>
+        <w:rPr>
+          <w:rFonts w:ascii="Times New Roman" w:eastAsia="Times New Roman" w:hAnsi="Times New Roman" w:cs="Times New Roman"/>
+          <w:sz w:val="24"/>
+          <w:szCs w:val="24"/>
+        </w:rPr>
+        <w:t>Frontend</w:t>
+      </w:r>
+      <w:proofErr w:type="spellEnd"/>
+      <w:r>
+        <w:rPr>
+          <w:rFonts w:ascii="Times New Roman" w:eastAsia="Times New Roman" w:hAnsi="Times New Roman" w:cs="Times New Roman"/>
+          <w:sz w:val="24"/>
+          <w:szCs w:val="24"/>
+        </w:rPr>
+        <w:t>/</w:t>
+      </w:r>
+      <w:proofErr w:type="spellStart"/>
+      <w:r>
+        <w:rPr>
+          <w:rFonts w:ascii="Times New Roman" w:eastAsia="Times New Roman" w:hAnsi="Times New Roman" w:cs="Times New Roman"/>
+          <w:sz w:val="24"/>
+          <w:szCs w:val="24"/>
+        </w:rPr>
+        <w:t>Backend</w:t>
+      </w:r>
+      <w:proofErr w:type="spellEnd"/>
+      <w:r>
+        <w:rPr>
+          <w:rFonts w:ascii="Times New Roman" w:eastAsia="Times New Roman" w:hAnsi="Times New Roman" w:cs="Times New Roman"/>
+          <w:sz w:val="24"/>
+          <w:szCs w:val="24"/>
+        </w:rPr>
+        <w:t>) como el motor MySQL dentro de la misma Máquina Virtual, cualquier sobrecarga en los recursos de procesami</w:t>
+      </w:r>
+      <w:r>
+        <w:rPr>
+          <w:rFonts w:ascii="Times New Roman" w:eastAsia="Times New Roman" w:hAnsi="Times New Roman" w:cs="Times New Roman"/>
+          <w:sz w:val="24"/>
+          <w:szCs w:val="24"/>
+        </w:rPr>
+        <w:t xml:space="preserve">ento, caída del sistema operativo Windows Server o detención inesperada del servicio XAMPP interrumpirá por completo la disponibilidad pública de la plataforma </w:t>
+      </w:r>
+      <w:proofErr w:type="spellStart"/>
+      <w:r>
+        <w:rPr>
+          <w:rFonts w:ascii="Times New Roman" w:eastAsia="Times New Roman" w:hAnsi="Times New Roman" w:cs="Times New Roman"/>
+          <w:sz w:val="24"/>
+          <w:szCs w:val="24"/>
+        </w:rPr>
+        <w:t>NexusLib</w:t>
+      </w:r>
+      <w:proofErr w:type="spellEnd"/>
+      <w:r>
+        <w:rPr>
+          <w:rFonts w:ascii="Times New Roman" w:eastAsia="Times New Roman" w:hAnsi="Times New Roman" w:cs="Times New Roman"/>
+          <w:sz w:val="24"/>
+          <w:szCs w:val="24"/>
+        </w:rPr>
+        <w:t>.</w:t>
       </w:r>
     </w:p>
     <w:p>
@@ -3652,19 +3728,7 @@
           <w:sz w:val="24"/>
           <w:szCs w:val="24"/>
         </w:rPr>
-        <w:lastRenderedPageBreak/>
-        <w:t>3</w:t>
-      </w:r>
-      <w:r>
-        <w:rPr>
-          <w:rFonts w:ascii="Times New Roman" w:eastAsia="Times New Roman" w:hAnsi="Times New Roman" w:cs="Times New Roman"/>
-          <w:b/>
-          <w:bCs/>
-          <w:color w:val="000000"/>
-          <w:sz w:val="24"/>
-          <w:szCs w:val="24"/>
-        </w:rPr>
-        <w:t>. Análisis de la situación actual</w:t>
+        <w:t>3. Análisis de la situación actual</w:t>
       </w:r>
     </w:p>
     <w:p>
@@ -3686,23 +3750,7 @@
           <w:sz w:val="24"/>
           <w:szCs w:val="24"/>
         </w:rPr>
-        <w:t>3</w:t>
-      </w:r>
-      <w:r>
-        <w:rPr>
-          <w:rFonts w:ascii="Times New Roman" w:eastAsia="Times New Roman" w:hAnsi="Times New Roman" w:cs="Times New Roman"/>
-          <w:sz w:val="24"/>
-          <w:szCs w:val="24"/>
-        </w:rPr>
-        <w:t>.1 Planteamiento d</w:t>
-      </w:r>
-      <w:r>
-        <w:rPr>
-          <w:rFonts w:ascii="Times New Roman" w:eastAsia="Times New Roman" w:hAnsi="Times New Roman" w:cs="Times New Roman"/>
-          <w:sz w:val="24"/>
-          <w:szCs w:val="24"/>
-        </w:rPr>
-        <w:t>el problema</w:t>
+        <w:t>3.1 Planteamiento del problema</w:t>
       </w:r>
     </w:p>
     <w:p>
@@ -3721,23 +3769,31 @@
           <w:sz w:val="24"/>
           <w:szCs w:val="24"/>
         </w:rPr>
-        <w:t>Si bien las instituciones académicas enfatizan constantemente la importancia del acceso a la información y la investigación de calidad, los métodos de búsqueda y localización de recursos bibliográficos pueden parecer anticuados y poco efectivos</w:t>
-      </w:r>
-      <w:r>
-        <w:rPr>
-          <w:rFonts w:ascii="Times New Roman" w:eastAsia="Times New Roman" w:hAnsi="Times New Roman" w:cs="Times New Roman"/>
-          <w:sz w:val="24"/>
-          <w:szCs w:val="24"/>
-        </w:rPr>
-        <w:t>. Es necesario modernizar la forma en que se procesa el acceso a la información en las facultades y bibliotecas universitarias. Aunque los estudiantes y docentes obtienen bases teóricas para sus investigaciones, no encuentran herramientas tecnológicas inte</w:t>
-      </w:r>
-      <w:r>
-        <w:rPr>
-          <w:rFonts w:ascii="Times New Roman" w:eastAsia="Times New Roman" w:hAnsi="Times New Roman" w:cs="Times New Roman"/>
-          <w:sz w:val="24"/>
-          <w:szCs w:val="24"/>
-        </w:rPr>
-        <w:t>gradas que les permitan localizar de manera ágil tanto el material físico como el digital en un solo lugar.</w:t>
+        <w:t>Si bien las instituc</w:t>
+      </w:r>
+      <w:r>
+        <w:rPr>
+          <w:rFonts w:ascii="Times New Roman" w:eastAsia="Times New Roman" w:hAnsi="Times New Roman" w:cs="Times New Roman"/>
+          <w:sz w:val="24"/>
+          <w:szCs w:val="24"/>
+        </w:rPr>
+        <w:t>iones académicas enfatizan constantemente la importancia del acceso a la información y la investigación de calidad, los métodos de búsqueda y localización de recursos bibliográficos pueden parecer anticuados y poco efectivos. Es necesario modernizar la for</w:t>
+      </w:r>
+      <w:r>
+        <w:rPr>
+          <w:rFonts w:ascii="Times New Roman" w:eastAsia="Times New Roman" w:hAnsi="Times New Roman" w:cs="Times New Roman"/>
+          <w:sz w:val="24"/>
+          <w:szCs w:val="24"/>
+        </w:rPr>
+        <w:t>ma en que se procesa el acceso a la información en las facultades y bibliotecas universitarias. Aunque los estudiantes y docentes obtienen bases teóricas para sus investigaciones, no encuentran herramientas tecnológicas integradas que les permitan localiza</w:t>
+      </w:r>
+      <w:r>
+        <w:rPr>
+          <w:rFonts w:ascii="Times New Roman" w:eastAsia="Times New Roman" w:hAnsi="Times New Roman" w:cs="Times New Roman"/>
+          <w:sz w:val="24"/>
+          <w:szCs w:val="24"/>
+        </w:rPr>
+        <w:t>r de manera ágil tanto el material físico como el digital en un solo lugar.</w:t>
       </w:r>
     </w:p>
     <w:p>
@@ -3756,23 +3812,23 @@
           <w:sz w:val="24"/>
           <w:szCs w:val="24"/>
         </w:rPr>
-        <w:t>La falta de una plataforma centralizada que combine el inventario físico con el repositorio virtual limita la posibilidad de que el tiempo invertido</w:t>
-      </w:r>
-      <w:r>
-        <w:rPr>
-          <w:rFonts w:ascii="Times New Roman" w:eastAsia="Times New Roman" w:hAnsi="Times New Roman" w:cs="Times New Roman"/>
-          <w:sz w:val="24"/>
-          <w:szCs w:val="24"/>
-        </w:rPr>
-        <w:t xml:space="preserve"> en la búsqueda se traduzca en una investigación eficiente. Este desajuste entre la existencia del recurso y su accesibilidad genera desmotivación: los investigadores no logran visualizar la totalidad de la oferta bibliográfica de la institución en una sol</w:t>
-      </w:r>
-      <w:r>
-        <w:rPr>
-          <w:rFonts w:ascii="Times New Roman" w:eastAsia="Times New Roman" w:hAnsi="Times New Roman" w:cs="Times New Roman"/>
-          <w:sz w:val="24"/>
-          <w:szCs w:val="24"/>
-        </w:rPr>
-        <w:t>a interfaz, mientras que los administradores de la biblioteca carecen de un sistema unificado que vincule la gestión de estanterías con los archivos electrónicos.</w:t>
+        <w:t>La falta de una plataforma centralizada que combine el inventario físico con el repositorio virtual limita la posibilidad de que el tiempo invertido en la búsqueda se traduzca en u</w:t>
+      </w:r>
+      <w:r>
+        <w:rPr>
+          <w:rFonts w:ascii="Times New Roman" w:eastAsia="Times New Roman" w:hAnsi="Times New Roman" w:cs="Times New Roman"/>
+          <w:sz w:val="24"/>
+          <w:szCs w:val="24"/>
+        </w:rPr>
+        <w:t>na investigación eficiente. Este desajuste entre la existencia del recurso y su accesibilidad genera desmotivación: los investigadores no logran visualizar la totalidad de la oferta bibliográfica de la institución en una sola interfaz, mientras que los adm</w:t>
+      </w:r>
+      <w:r>
+        <w:rPr>
+          <w:rFonts w:ascii="Times New Roman" w:eastAsia="Times New Roman" w:hAnsi="Times New Roman" w:cs="Times New Roman"/>
+          <w:sz w:val="24"/>
+          <w:szCs w:val="24"/>
+        </w:rPr>
+        <w:t>inistradores de la biblioteca carecen de un sistema unificado que vincule la gestión de estanterías con los archivos electrónicos.</w:t>
       </w:r>
     </w:p>
     <w:p>
@@ -3794,15 +3850,7 @@
           <w:sz w:val="24"/>
           <w:szCs w:val="24"/>
         </w:rPr>
-        <w:t>3</w:t>
-      </w:r>
-      <w:r>
-        <w:rPr>
-          <w:rFonts w:ascii="Times New Roman" w:eastAsia="Times New Roman" w:hAnsi="Times New Roman" w:cs="Times New Roman"/>
-          <w:sz w:val="24"/>
-          <w:szCs w:val="24"/>
-        </w:rPr>
-        <w:t>.2 Consideraciones de hardware y software</w:t>
+        <w:t>3.2 Consideraciones de hardware y software</w:t>
       </w:r>
     </w:p>
     <w:p>
@@ -3944,7 +3992,7 @@
           <w:sz w:val="24"/>
           <w:szCs w:val="24"/>
         </w:rPr>
-        <w:t xml:space="preserve"> Unidad SSD para garantizar la eficiencia en la persistencia de datos de MySQL, logs de transacciones e historiales de búsqueda.</w:t>
+        <w:t xml:space="preserve"> Almacenamiento SSD para garantizar la máxima eficiencia en la persistencia de datos de MySQL, control de logs de transacciones e historiales de búsqueda híbrida.</w:t>
       </w:r>
     </w:p>
     <w:p>
@@ -4017,15 +4065,15 @@
           <w:sz w:val="24"/>
           <w:szCs w:val="24"/>
         </w:rPr>
-        <w:t xml:space="preserve"> (configurado con extensiones para PHP 8.2.</w:t>
-      </w:r>
-      <w:r>
-        <w:rPr>
-          <w:rFonts w:ascii="Times New Roman" w:eastAsia="Times New Roman" w:hAnsi="Times New Roman" w:cs="Times New Roman"/>
-          <w:sz w:val="24"/>
-          <w:szCs w:val="24"/>
-        </w:rPr>
-        <w:t>12 y validación de sintaxis).</w:t>
+        <w:t xml:space="preserve"> (configurado con extensiones para PHP 8.2</w:t>
+      </w:r>
+      <w:r>
+        <w:rPr>
+          <w:rFonts w:ascii="Times New Roman" w:eastAsia="Times New Roman" w:hAnsi="Times New Roman" w:cs="Times New Roman"/>
+          <w:sz w:val="24"/>
+          <w:szCs w:val="24"/>
+        </w:rPr>
+        <w:t>.12 y validación de sintaxis).</w:t>
       </w:r>
     </w:p>
     <w:p>
@@ -4051,15 +4099,16 @@
           <w:sz w:val="24"/>
           <w:szCs w:val="24"/>
         </w:rPr>
-        <w:t>Servidor Local:</w:t>
-      </w:r>
-      <w:r>
-        <w:rPr>
-          <w:rFonts w:ascii="Times New Roman" w:eastAsia="Times New Roman" w:hAnsi="Times New Roman" w:cs="Times New Roman"/>
-          <w:sz w:val="24"/>
-          <w:szCs w:val="24"/>
-        </w:rPr>
-        <w:t xml:space="preserve"> XAMPP (Apache para el servidor web y motor de base de datos MySQL). </w:t>
+        <w:lastRenderedPageBreak/>
+        <w:t>Servidor de Despliegue (Local y Producción):</w:t>
+      </w:r>
+      <w:r>
+        <w:rPr>
+          <w:rFonts w:ascii="Times New Roman" w:eastAsia="Times New Roman" w:hAnsi="Times New Roman" w:cs="Times New Roman"/>
+          <w:sz w:val="24"/>
+          <w:szCs w:val="24"/>
+        </w:rPr>
+        <w:t xml:space="preserve"> XAMPP ejecutado de forma unificada (Servicio web Apache y motor de base de datos MySQL activos continuamente).</w:t>
       </w:r>
     </w:p>
     <w:p>
@@ -4111,7 +4160,15 @@
           <w:sz w:val="24"/>
           <w:szCs w:val="24"/>
         </w:rPr>
-        <w:t xml:space="preserve"> para la administración de tablas y relaciones).</w:t>
+        <w:t xml:space="preserve"> para la admini</w:t>
+      </w:r>
+      <w:r>
+        <w:rPr>
+          <w:rFonts w:ascii="Times New Roman" w:eastAsia="Times New Roman" w:hAnsi="Times New Roman" w:cs="Times New Roman"/>
+          <w:sz w:val="24"/>
+          <w:szCs w:val="24"/>
+        </w:rPr>
+        <w:t>stración de tablas y relaciones).</w:t>
       </w:r>
     </w:p>
     <w:p>
@@ -4145,15 +4202,7 @@
           <w:sz w:val="24"/>
           <w:szCs w:val="24"/>
         </w:rPr>
-        <w:t xml:space="preserve"> Integración</w:t>
-      </w:r>
-      <w:r>
-        <w:rPr>
-          <w:rFonts w:ascii="Times New Roman" w:eastAsia="Times New Roman" w:hAnsi="Times New Roman" w:cs="Times New Roman"/>
-          <w:sz w:val="24"/>
-          <w:szCs w:val="24"/>
-        </w:rPr>
-        <w:t xml:space="preserve"> multicanal con Alpha Cloud, E-Libro y la base de datos local de la UPT para la recuperación y unificación automatizada de recursos bibliográficos.</w:t>
+        <w:t xml:space="preserve"> Integración multicanal con Alpha Cloud, E-Libro y la base de datos local de la UPT para la recuperación y unificación automatizada de recursos bibliográficos.</w:t>
       </w:r>
     </w:p>
     <w:p>
@@ -4179,15 +4228,15 @@
           <w:sz w:val="24"/>
           <w:szCs w:val="24"/>
         </w:rPr>
-        <w:t>Nube:</w:t>
-      </w:r>
-      <w:r>
-        <w:rPr>
-          <w:rFonts w:ascii="Times New Roman" w:eastAsia="Times New Roman" w:hAnsi="Times New Roman" w:cs="Times New Roman"/>
-          <w:sz w:val="24"/>
-          <w:szCs w:val="24"/>
-        </w:rPr>
-        <w:t xml:space="preserve"> Azure App </w:t>
+        <w:t>Plataforma en la Nube:</w:t>
+      </w:r>
+      <w:r>
+        <w:rPr>
+          <w:rFonts w:ascii="Times New Roman" w:eastAsia="Times New Roman" w:hAnsi="Times New Roman" w:cs="Times New Roman"/>
+          <w:sz w:val="24"/>
+          <w:szCs w:val="24"/>
+        </w:rPr>
+        <w:t xml:space="preserve"> Microsoft Azure (Virtual Machine </w:t>
       </w:r>
       <w:proofErr w:type="spellStart"/>
       <w:r>
@@ -4196,7 +4245,7 @@
           <w:sz w:val="24"/>
           <w:szCs w:val="24"/>
         </w:rPr>
-        <w:t>Service</w:t>
+        <w:t>Instance</w:t>
       </w:r>
       <w:proofErr w:type="spellEnd"/>
       <w:r>
@@ -4205,7 +4254,7 @@
           <w:sz w:val="24"/>
           <w:szCs w:val="24"/>
         </w:rPr>
-        <w:t xml:space="preserve"> y Azure </w:t>
+        <w:t xml:space="preserve"> - Región </w:t>
       </w:r>
       <w:proofErr w:type="spellStart"/>
       <w:r>
@@ -4214,7 +4263,7 @@
           <w:sz w:val="24"/>
           <w:szCs w:val="24"/>
         </w:rPr>
-        <w:t>Database</w:t>
+        <w:t>Canada</w:t>
       </w:r>
       <w:proofErr w:type="spellEnd"/>
       <w:r>
@@ -4223,25 +4272,7 @@
           <w:sz w:val="24"/>
           <w:szCs w:val="24"/>
         </w:rPr>
-        <w:t xml:space="preserve"> </w:t>
-      </w:r>
-      <w:proofErr w:type="spellStart"/>
-      <w:r>
-        <w:rPr>
-          <w:rFonts w:ascii="Times New Roman" w:eastAsia="Times New Roman" w:hAnsi="Times New Roman" w:cs="Times New Roman"/>
-          <w:sz w:val="24"/>
-          <w:szCs w:val="24"/>
-        </w:rPr>
-        <w:t>for</w:t>
-      </w:r>
-      <w:proofErr w:type="spellEnd"/>
-      <w:r>
-        <w:rPr>
-          <w:rFonts w:ascii="Times New Roman" w:eastAsia="Times New Roman" w:hAnsi="Times New Roman" w:cs="Times New Roman"/>
-          <w:sz w:val="24"/>
-          <w:szCs w:val="24"/>
-        </w:rPr>
-        <w:t xml:space="preserve"> MySQL.</w:t>
+        <w:t xml:space="preserve"> Central).</w:t>
       </w:r>
     </w:p>
     <w:p>
@@ -4267,16 +4298,25 @@
           <w:sz w:val="24"/>
           <w:szCs w:val="24"/>
         </w:rPr>
-        <w:lastRenderedPageBreak/>
-        <w:t>Infraestructura como Código:</w:t>
-      </w:r>
-      <w:r>
-        <w:rPr>
-          <w:rFonts w:ascii="Times New Roman" w:eastAsia="Times New Roman" w:hAnsi="Times New Roman" w:cs="Times New Roman"/>
-          <w:sz w:val="24"/>
-          <w:szCs w:val="24"/>
-        </w:rPr>
-        <w:t xml:space="preserve"> </w:t>
+        <w:t>Siste</w:t>
+      </w:r>
+      <w:r>
+        <w:rPr>
+          <w:rFonts w:ascii="Times New Roman" w:eastAsia="Times New Roman" w:hAnsi="Times New Roman" w:cs="Times New Roman"/>
+          <w:b/>
+          <w:bCs/>
+          <w:sz w:val="24"/>
+          <w:szCs w:val="24"/>
+        </w:rPr>
+        <w:t xml:space="preserve">ma Operativo del Servidor: </w:t>
+      </w:r>
+      <w:r>
+        <w:rPr>
+          <w:rFonts w:ascii="Times New Roman" w:eastAsia="Times New Roman" w:hAnsi="Times New Roman" w:cs="Times New Roman"/>
+          <w:sz w:val="24"/>
+          <w:szCs w:val="24"/>
+        </w:rPr>
+        <w:t xml:space="preserve">Windows Server 2025 </w:t>
       </w:r>
       <w:proofErr w:type="spellStart"/>
       <w:r>
@@ -4285,7 +4325,7 @@
           <w:sz w:val="24"/>
           <w:szCs w:val="24"/>
         </w:rPr>
-        <w:t>Terraform</w:t>
+        <w:t>Datacenter</w:t>
       </w:r>
       <w:proofErr w:type="spellEnd"/>
       <w:r>
@@ -4294,15 +4334,7 @@
           <w:sz w:val="24"/>
           <w:szCs w:val="24"/>
         </w:rPr>
-        <w:t xml:space="preserve"> v1.x (para el apr</w:t>
-      </w:r>
-      <w:r>
-        <w:rPr>
-          <w:rFonts w:ascii="Times New Roman" w:eastAsia="Times New Roman" w:hAnsi="Times New Roman" w:cs="Times New Roman"/>
-          <w:sz w:val="24"/>
-          <w:szCs w:val="24"/>
-        </w:rPr>
-        <w:t>ovisionamiento de recursos en la nube y análisis económico).</w:t>
+        <w:t>.</w:t>
       </w:r>
     </w:p>
     <w:p>
@@ -4400,18 +4432,7 @@
           <w:sz w:val="24"/>
           <w:szCs w:val="24"/>
         </w:rPr>
-        <w:t>4</w:t>
-      </w:r>
-      <w:r>
-        <w:rPr>
-          <w:rFonts w:ascii="Times New Roman" w:eastAsia="Times New Roman" w:hAnsi="Times New Roman" w:cs="Times New Roman"/>
-          <w:b/>
-          <w:bCs/>
-          <w:color w:val="000000"/>
-          <w:sz w:val="24"/>
-          <w:szCs w:val="24"/>
-        </w:rPr>
-        <w:t>. Estudio de Factibilidad</w:t>
+        <w:t>4. Estudio de Factibilidad</w:t>
       </w:r>
     </w:p>
     <w:p>
@@ -4433,15 +4454,7 @@
           <w:sz w:val="24"/>
           <w:szCs w:val="24"/>
         </w:rPr>
-        <w:t>4</w:t>
-      </w:r>
-      <w:r>
-        <w:rPr>
-          <w:rFonts w:ascii="Times New Roman" w:eastAsia="Times New Roman" w:hAnsi="Times New Roman" w:cs="Times New Roman"/>
-          <w:sz w:val="24"/>
-          <w:szCs w:val="24"/>
-        </w:rPr>
-        <w:t>.1 Factibilidad Técnica</w:t>
+        <w:t>4.1 Factibilidad Técnica</w:t>
       </w:r>
     </w:p>
     <w:p>
@@ -4460,23 +4473,23 @@
           <w:sz w:val="24"/>
           <w:szCs w:val="24"/>
         </w:rPr>
-        <w:t xml:space="preserve">El proyecto resulta factible desde el punto de vista técnico, ya que </w:t>
-      </w:r>
-      <w:r>
-        <w:rPr>
-          <w:rFonts w:ascii="Times New Roman" w:eastAsia="Times New Roman" w:hAnsi="Times New Roman" w:cs="Times New Roman"/>
-          <w:sz w:val="24"/>
-          <w:szCs w:val="24"/>
-        </w:rPr>
-        <w:t>el equipo de desarrollo cuenta con las competencias necesarias en ingeniería de sistemas para implementar y mantener la arquitectura propuesta bajo un enfoque de microservicios utilizando PHP. La solución utiliza tecnologías de código abierto con amplio so</w:t>
-      </w:r>
-      <w:r>
-        <w:rPr>
-          <w:rFonts w:ascii="Times New Roman" w:eastAsia="Times New Roman" w:hAnsi="Times New Roman" w:cs="Times New Roman"/>
-          <w:sz w:val="24"/>
-          <w:szCs w:val="24"/>
-        </w:rPr>
-        <w:t>porte comunitario, garantizando la estabilidad operativa y la flexibilidad del buscador unificado.</w:t>
+        <w:t>El proyecto resulta factible desde el punto de vista técnico, ya que el</w:t>
+      </w:r>
+      <w:r>
+        <w:rPr>
+          <w:rFonts w:ascii="Times New Roman" w:eastAsia="Times New Roman" w:hAnsi="Times New Roman" w:cs="Times New Roman"/>
+          <w:sz w:val="24"/>
+          <w:szCs w:val="24"/>
+        </w:rPr>
+        <w:t xml:space="preserve"> equipo de desarrollo cuenta con las competencias necesarias en ingeniería de sistemas para implementar y mantener la arquitectura propuesta bajo un enfoque de microservicios utilizando PHP. La solución utiliza tecnologías de código abierto con amplio sopo</w:t>
+      </w:r>
+      <w:r>
+        <w:rPr>
+          <w:rFonts w:ascii="Times New Roman" w:eastAsia="Times New Roman" w:hAnsi="Times New Roman" w:cs="Times New Roman"/>
+          <w:sz w:val="24"/>
+          <w:szCs w:val="24"/>
+        </w:rPr>
+        <w:t>rte comunitario, garantizando la estabilidad operativa y la flexibilidad del buscador unificado.</w:t>
       </w:r>
     </w:p>
     <w:p>
@@ -4548,15 +4561,15 @@
           <w:sz w:val="24"/>
           <w:szCs w:val="24"/>
         </w:rPr>
-        <w:t xml:space="preserve"> El equipo posee experiencia en el desarrollo web con PHP 8.2.12 y</w:t>
-      </w:r>
-      <w:r>
-        <w:rPr>
-          <w:rFonts w:ascii="Times New Roman" w:eastAsia="Times New Roman" w:hAnsi="Times New Roman" w:cs="Times New Roman"/>
-          <w:sz w:val="24"/>
-          <w:szCs w:val="24"/>
-        </w:rPr>
-        <w:t xml:space="preserve"> el uso de Visual Studio </w:t>
+        <w:t xml:space="preserve"> El equipo posee experiencia en el desarrollo web con PHP 8.2.12 y e</w:t>
+      </w:r>
+      <w:r>
+        <w:rPr>
+          <w:rFonts w:ascii="Times New Roman" w:eastAsia="Times New Roman" w:hAnsi="Times New Roman" w:cs="Times New Roman"/>
+          <w:sz w:val="24"/>
+          <w:szCs w:val="24"/>
+        </w:rPr>
+        <w:t xml:space="preserve">l uso de Visual Studio </w:t>
       </w:r>
       <w:proofErr w:type="spellStart"/>
       <w:r>
@@ -4605,15 +4618,15 @@
           <w:sz w:val="24"/>
           <w:szCs w:val="24"/>
         </w:rPr>
-        <w:t xml:space="preserve"> Se implementará una estructura que unifica el acceso a Alpha Cloud, E-Libro y la base de datos local d</w:t>
-      </w:r>
-      <w:r>
-        <w:rPr>
-          <w:rFonts w:ascii="Times New Roman" w:eastAsia="Times New Roman" w:hAnsi="Times New Roman" w:cs="Times New Roman"/>
-          <w:sz w:val="24"/>
-          <w:szCs w:val="24"/>
-        </w:rPr>
-        <w:t>e la UPT, asegurando un procesamiento eficiente de consultas híbridas mediante microservicios que integran estos catálogos de manera transparente.</w:t>
+        <w:t xml:space="preserve"> Se implementará una estructura que unifica el acceso a Alpha Cloud, E-Libro y la base de datos local de </w:t>
+      </w:r>
+      <w:r>
+        <w:rPr>
+          <w:rFonts w:ascii="Times New Roman" w:eastAsia="Times New Roman" w:hAnsi="Times New Roman" w:cs="Times New Roman"/>
+          <w:sz w:val="24"/>
+          <w:szCs w:val="24"/>
+        </w:rPr>
+        <w:t>la UPT, asegurando un procesamiento eficiente de consultas híbridas mediante microservicios que integran estos catálogos de manera transparente.</w:t>
       </w:r>
     </w:p>
     <w:p>
@@ -4644,7 +4657,7 @@
           <w:sz w:val="24"/>
           <w:szCs w:val="24"/>
         </w:rPr>
-        <w:t xml:space="preserve"> Se utilizará MySQL (gestionado mediante </w:t>
+        <w:t xml:space="preserve"> Se utiliza MySQL local dentro del servidor en la nube, administrado remotamente mediante </w:t>
       </w:r>
       <w:proofErr w:type="spellStart"/>
       <w:r>
@@ -4662,43 +4675,7 @@
           <w:sz w:val="24"/>
           <w:szCs w:val="24"/>
         </w:rPr>
-        <w:t xml:space="preserve">) para la administración de inventarios locales, asegurando una integración fluida con los servicios de Azure </w:t>
-      </w:r>
-      <w:proofErr w:type="spellStart"/>
-      <w:r>
-        <w:rPr>
-          <w:rFonts w:ascii="Times New Roman" w:eastAsia="Times New Roman" w:hAnsi="Times New Roman" w:cs="Times New Roman"/>
-          <w:sz w:val="24"/>
-          <w:szCs w:val="24"/>
-        </w:rPr>
-        <w:t>Database</w:t>
-      </w:r>
-      <w:proofErr w:type="spellEnd"/>
-      <w:r>
-        <w:rPr>
-          <w:rFonts w:ascii="Times New Roman" w:eastAsia="Times New Roman" w:hAnsi="Times New Roman" w:cs="Times New Roman"/>
-          <w:sz w:val="24"/>
-          <w:szCs w:val="24"/>
-        </w:rPr>
-        <w:t xml:space="preserve"> </w:t>
-      </w:r>
-      <w:proofErr w:type="spellStart"/>
-      <w:r>
-        <w:rPr>
-          <w:rFonts w:ascii="Times New Roman" w:eastAsia="Times New Roman" w:hAnsi="Times New Roman" w:cs="Times New Roman"/>
-          <w:sz w:val="24"/>
-          <w:szCs w:val="24"/>
-        </w:rPr>
-        <w:t>for</w:t>
-      </w:r>
-      <w:proofErr w:type="spellEnd"/>
-      <w:r>
-        <w:rPr>
-          <w:rFonts w:ascii="Times New Roman" w:eastAsia="Times New Roman" w:hAnsi="Times New Roman" w:cs="Times New Roman"/>
-          <w:sz w:val="24"/>
-          <w:szCs w:val="24"/>
-        </w:rPr>
-        <w:t xml:space="preserve"> MySQL para la persistencia en la nube.</w:t>
+        <w:t>, lo que permite un control directo sobre las tablas de favoritos, usuarios y reservas sin intermediarios.</w:t>
       </w:r>
     </w:p>
     <w:p>
@@ -4721,15 +4698,23 @@
           <w:sz w:val="24"/>
           <w:szCs w:val="24"/>
         </w:rPr>
-        <w:t>Infraestructura y Automatización:</w:t>
-      </w:r>
-      <w:r>
-        <w:rPr>
-          <w:rFonts w:ascii="Times New Roman" w:eastAsia="Times New Roman" w:hAnsi="Times New Roman" w:cs="Times New Roman"/>
-          <w:sz w:val="24"/>
-          <w:szCs w:val="24"/>
-        </w:rPr>
-        <w:t xml:space="preserve"> El uso de Microsoft Azure proporciona la escalabilidad necesaria para el almacenamiento de archivos, mientras que </w:t>
+        <w:t>Infraestructura y Despliegue:</w:t>
+      </w:r>
+      <w:r>
+        <w:rPr>
+          <w:rFonts w:ascii="Times New Roman" w:eastAsia="Times New Roman" w:hAnsi="Times New Roman" w:cs="Times New Roman"/>
+          <w:sz w:val="24"/>
+          <w:szCs w:val="24"/>
+        </w:rPr>
+        <w:t xml:space="preserve"> El uso de una Máquina</w:t>
+      </w:r>
+      <w:r>
+        <w:rPr>
+          <w:rFonts w:ascii="Times New Roman" w:eastAsia="Times New Roman" w:hAnsi="Times New Roman" w:cs="Times New Roman"/>
+          <w:sz w:val="24"/>
+          <w:szCs w:val="24"/>
+        </w:rPr>
+        <w:t xml:space="preserve"> Virtual dedicada en Microsoft Azure proporciona la capacidad de cómputo necesaria (2 </w:t>
       </w:r>
       <w:proofErr w:type="spellStart"/>
       <w:r>
@@ -4738,7 +4723,7 @@
           <w:sz w:val="24"/>
           <w:szCs w:val="24"/>
         </w:rPr>
-        <w:t>Terraform</w:t>
+        <w:t>vCPU</w:t>
       </w:r>
       <w:proofErr w:type="spellEnd"/>
       <w:r>
@@ -4747,15 +4732,24 @@
           <w:sz w:val="24"/>
           <w:szCs w:val="24"/>
         </w:rPr>
-        <w:t xml:space="preserve"> permite gestionar dicha infraestructura mediante código, minimizando errores de configuración manu</w:t>
-      </w:r>
-      <w:r>
-        <w:rPr>
-          <w:rFonts w:ascii="Times New Roman" w:eastAsia="Times New Roman" w:hAnsi="Times New Roman" w:cs="Times New Roman"/>
-          <w:sz w:val="24"/>
-          <w:szCs w:val="24"/>
-        </w:rPr>
-        <w:t>al.</w:t>
+        <w:t xml:space="preserve"> y 4 </w:t>
+      </w:r>
+      <w:r>
+        <w:rPr>
+          <w:rFonts w:ascii="Times New Roman" w:eastAsia="Times New Roman" w:hAnsi="Times New Roman" w:cs="Times New Roman"/>
+          <w:sz w:val="24"/>
+          <w:szCs w:val="24"/>
+        </w:rPr>
+        <w:lastRenderedPageBreak/>
+        <w:t>GB RAM) para mantener el software Apache corriendo continuamente, exponiendo el puerto 80 hacia internet mediante una dirección IP y etiqueta DNS pública asignad</w:t>
+      </w:r>
+      <w:r>
+        <w:rPr>
+          <w:rFonts w:ascii="Times New Roman" w:eastAsia="Times New Roman" w:hAnsi="Times New Roman" w:cs="Times New Roman"/>
+          <w:sz w:val="24"/>
+          <w:szCs w:val="24"/>
+        </w:rPr>
+        <w:t>a por Azure.</w:t>
       </w:r>
     </w:p>
     <w:p>
@@ -4805,16 +4799,15 @@
           <w:sz w:val="24"/>
           <w:szCs w:val="24"/>
         </w:rPr>
-        <w:lastRenderedPageBreak/>
-        <w:t>La estructura modular</w:t>
-      </w:r>
-      <w:r>
-        <w:rPr>
-          <w:rFonts w:ascii="Times New Roman" w:eastAsia="Times New Roman" w:hAnsi="Times New Roman" w:cs="Times New Roman"/>
-          <w:sz w:val="24"/>
-          <w:szCs w:val="24"/>
-        </w:rPr>
-        <w:t xml:space="preserve"> y distribuida del sistema asegura que la plataforma pueda escalar y adaptarse con facilidad, permitiendo integrar nuevas fuentes de datos bibliográficos en el futuro sin afectar la disponibilidad de los servicios actuales.</w:t>
+        <w:t>La estructur</w:t>
+      </w:r>
+      <w:r>
+        <w:rPr>
+          <w:rFonts w:ascii="Times New Roman" w:eastAsia="Times New Roman" w:hAnsi="Times New Roman" w:cs="Times New Roman"/>
+          <w:sz w:val="24"/>
+          <w:szCs w:val="24"/>
+        </w:rPr>
+        <w:t>a modular y distribuida del sistema asegura que la plataforma pueda escalar y adaptarse con facilidad, permitiendo integrar nuevas fuentes de datos bibliográficos en el futuro sin afectar la disponibilidad de los servicios actuales.</w:t>
       </w:r>
     </w:p>
     <w:p>
@@ -4836,15 +4829,15 @@
           <w:sz w:val="24"/>
           <w:szCs w:val="24"/>
         </w:rPr>
-        <w:t>4</w:t>
-      </w:r>
-      <w:r>
-        <w:rPr>
-          <w:rFonts w:ascii="Times New Roman" w:eastAsia="Times New Roman" w:hAnsi="Times New Roman" w:cs="Times New Roman"/>
-          <w:sz w:val="24"/>
-          <w:szCs w:val="24"/>
-        </w:rPr>
-        <w:t>.2 Factibilidad Económica</w:t>
+        <w:t>4.2 Factibilidad Económ</w:t>
+      </w:r>
+      <w:r>
+        <w:rPr>
+          <w:rFonts w:ascii="Times New Roman" w:eastAsia="Times New Roman" w:hAnsi="Times New Roman" w:cs="Times New Roman"/>
+          <w:sz w:val="24"/>
+          <w:szCs w:val="24"/>
+        </w:rPr>
+        <w:t>ica</w:t>
       </w:r>
     </w:p>
     <w:p>
@@ -4863,15 +4856,7 @@
           <w:sz w:val="24"/>
           <w:szCs w:val="24"/>
         </w:rPr>
-        <w:t xml:space="preserve">Este </w:t>
-      </w:r>
-      <w:r>
-        <w:rPr>
-          <w:rFonts w:ascii="Times New Roman" w:eastAsia="Times New Roman" w:hAnsi="Times New Roman" w:cs="Times New Roman"/>
-          <w:sz w:val="24"/>
-          <w:szCs w:val="24"/>
-        </w:rPr>
-        <w:t>apartado evalúa la inversión necesaria para el desarrollo y puesta en marcha del sistema, asegurando que los recursos financieros sean utilizados de manera eficiente.</w:t>
+        <w:t>Este apartado evalúa la inversión necesaria para el desarrollo y puesta en marcha del sistema, asegurando que los recursos financieros sean utilizados de manera eficiente.</w:t>
       </w:r>
     </w:p>
     <w:p>
@@ -4893,21 +4878,54 @@
           <w:sz w:val="24"/>
           <w:szCs w:val="24"/>
         </w:rPr>
-        <w:t>4</w:t>
-      </w:r>
-      <w:r>
-        <w:rPr>
-          <w:rFonts w:ascii="Times New Roman" w:eastAsia="Times New Roman" w:hAnsi="Times New Roman" w:cs="Times New Roman"/>
-          <w:sz w:val="24"/>
-          <w:szCs w:val="24"/>
-        </w:rPr>
-        <w:t>.2.1 Costos de software</w:t>
-      </w:r>
+        <w:t>4.2.1 Costos de software</w:t>
+      </w:r>
+    </w:p>
+    <w:p>
+      <w:pPr>
+        <w:spacing w:after="0" w:line="360" w:lineRule="auto"/>
+        <w:jc w:val="both"/>
+        <w:rPr>
+          <w:rFonts w:ascii="Times New Roman" w:eastAsia="Times New Roman" w:hAnsi="Times New Roman" w:cs="Times New Roman"/>
+          <w:sz w:val="24"/>
+          <w:szCs w:val="24"/>
+        </w:rPr>
+      </w:pPr>
+      <w:r>
+        <w:rPr>
+          <w:rFonts w:ascii="Times New Roman" w:eastAsia="Times New Roman" w:hAnsi="Times New Roman" w:cs="Times New Roman"/>
+          <w:sz w:val="24"/>
+          <w:szCs w:val="24"/>
+        </w:rPr>
+        <w:t>Incluye las herramientas digitales y servicios de infra</w:t>
+      </w:r>
+      <w:r>
+        <w:rPr>
+          <w:rFonts w:ascii="Times New Roman" w:eastAsia="Times New Roman" w:hAnsi="Times New Roman" w:cs="Times New Roman"/>
+          <w:sz w:val="24"/>
+          <w:szCs w:val="24"/>
+        </w:rPr>
+        <w:t>estructura en la nube proyectados. Como indica la rúbrica, los costos de Azure se basan en el análisis técnico de la Máquina Virtual y su entorno XAMPP.</w:t>
+      </w:r>
+    </w:p>
+    <w:p>
+      <w:pPr>
+        <w:pStyle w:val="Ttulo3"/>
+        <w:spacing w:before="0" w:after="0" w:line="360" w:lineRule="auto"/>
+        <w:jc w:val="both"/>
+        <w:rPr>
+          <w:rFonts w:ascii="Times New Roman" w:eastAsia="Times New Roman" w:hAnsi="Times New Roman" w:cs="Times New Roman"/>
+          <w:sz w:val="24"/>
+          <w:szCs w:val="24"/>
+        </w:rPr>
+      </w:pPr>
+      <w:bookmarkStart w:id="17" w:name="_heading=h.4sccqioz4fwx" w:colFirst="0" w:colLast="0"/>
+      <w:bookmarkEnd w:id="17"/>
     </w:p>
     <w:tbl>
       <w:tblPr>
         <w:tblStyle w:val="a0"/>
-        <w:tblpPr w:leftFromText="180" w:rightFromText="180" w:topFromText="180" w:bottomFromText="180" w:vertAnchor="text" w:tblpY="1175"/>
+        <w:tblpPr w:leftFromText="180" w:rightFromText="180" w:topFromText="180" w:bottomFromText="180" w:vertAnchor="text" w:tblpX="9" w:tblpY="19"/>
         <w:tblW w:w="8505" w:type="dxa"/>
         <w:tblInd w:w="0" w:type="dxa"/>
         <w:tblBorders>
@@ -5207,7 +5225,7 @@
                 <w:sz w:val="24"/>
                 <w:szCs w:val="24"/>
               </w:rPr>
-              <w:t xml:space="preserve">Azure </w:t>
+              <w:t xml:space="preserve">Azure VM (Standard B2als v2 - 2 </w:t>
             </w:r>
             <w:proofErr w:type="spellStart"/>
             <w:r>
@@ -5217,7 +5235,7 @@
                 <w:sz w:val="24"/>
                 <w:szCs w:val="24"/>
               </w:rPr>
-              <w:t>Database</w:t>
+              <w:t>vCPU</w:t>
             </w:r>
             <w:proofErr w:type="spellEnd"/>
             <w:r>
@@ -5227,27 +5245,7 @@
                 <w:sz w:val="24"/>
                 <w:szCs w:val="24"/>
               </w:rPr>
-              <w:t xml:space="preserve"> </w:t>
-            </w:r>
-            <w:proofErr w:type="spellStart"/>
-            <w:r>
-              <w:rPr>
-                <w:rFonts w:ascii="Times New Roman" w:eastAsia="Times New Roman" w:hAnsi="Times New Roman" w:cs="Times New Roman"/>
-                <w:color w:val="1F1F1F"/>
-                <w:sz w:val="24"/>
-                <w:szCs w:val="24"/>
-              </w:rPr>
-              <w:t>for</w:t>
-            </w:r>
-            <w:proofErr w:type="spellEnd"/>
-            <w:r>
-              <w:rPr>
-                <w:rFonts w:ascii="Times New Roman" w:eastAsia="Times New Roman" w:hAnsi="Times New Roman" w:cs="Times New Roman"/>
-                <w:color w:val="1F1F1F"/>
-                <w:sz w:val="24"/>
-                <w:szCs w:val="24"/>
-              </w:rPr>
-              <w:t xml:space="preserve"> MySQL</w:t>
+              <w:t>, 4 GB RAM) + Licencia Windows Server</w:t>
             </w:r>
           </w:p>
         </w:tc>
@@ -5283,7 +5281,7 @@
                 <w:sz w:val="24"/>
                 <w:szCs w:val="24"/>
               </w:rPr>
-              <w:t>220</w:t>
+              <w:t>310</w:t>
             </w:r>
           </w:p>
         </w:tc>
@@ -5355,7 +5353,7 @@
                 <w:sz w:val="24"/>
                 <w:szCs w:val="24"/>
               </w:rPr>
-              <w:t>660</w:t>
+              <w:t>930</w:t>
             </w:r>
           </w:p>
         </w:tc>
@@ -5432,7 +5430,7 @@
                 <w:sz w:val="24"/>
                 <w:szCs w:val="24"/>
               </w:rPr>
-              <w:t xml:space="preserve">Azure App </w:t>
+              <w:t>Almacenamiento Azure Estándar SSD (64 GB) + Tráfico de Red (</w:t>
             </w:r>
             <w:proofErr w:type="spellStart"/>
             <w:r>
@@ -5442,7 +5440,7 @@
                 <w:sz w:val="24"/>
                 <w:szCs w:val="24"/>
               </w:rPr>
-              <w:t>Service</w:t>
+              <w:t>Egress</w:t>
             </w:r>
             <w:proofErr w:type="spellEnd"/>
             <w:r>
@@ -5452,7 +5450,7 @@
                 <w:sz w:val="24"/>
                 <w:szCs w:val="24"/>
               </w:rPr>
-              <w:t xml:space="preserve"> Plan (Linux/PHP)</w:t>
+              <w:t>)</w:t>
             </w:r>
           </w:p>
         </w:tc>
@@ -5488,7 +5486,7 @@
                 <w:sz w:val="24"/>
                 <w:szCs w:val="24"/>
               </w:rPr>
-              <w:t>170</w:t>
+              <w:t>80</w:t>
             </w:r>
           </w:p>
         </w:tc>
@@ -5560,7 +5558,7 @@
                 <w:sz w:val="24"/>
                 <w:szCs w:val="24"/>
               </w:rPr>
-              <w:t>510</w:t>
+              <w:t>240</w:t>
             </w:r>
           </w:p>
         </w:tc>
@@ -5601,7 +5599,7 @@
                 <w:sz w:val="24"/>
                 <w:szCs w:val="24"/>
               </w:rPr>
-              <w:t>4</w:t>
+              <w:t>3</w:t>
             </w:r>
           </w:p>
         </w:tc>
@@ -5637,7 +5635,7 @@
                 <w:sz w:val="24"/>
                 <w:szCs w:val="24"/>
               </w:rPr>
-              <w:t>Certificado SSL / Dominio</w:t>
+              <w:t>Certificado SSL / Gestión de Dominio Web</w:t>
             </w:r>
           </w:p>
         </w:tc>
@@ -5919,47 +5917,6 @@
     </w:tbl>
     <w:p>
       <w:pPr>
-        <w:spacing w:after="0" w:line="360" w:lineRule="auto"/>
-        <w:jc w:val="both"/>
-        <w:rPr>
-          <w:rFonts w:ascii="Times New Roman" w:eastAsia="Times New Roman" w:hAnsi="Times New Roman" w:cs="Times New Roman"/>
-          <w:sz w:val="24"/>
-          <w:szCs w:val="24"/>
-        </w:rPr>
-      </w:pPr>
-      <w:r>
-        <w:rPr>
-          <w:rFonts w:ascii="Times New Roman" w:eastAsia="Times New Roman" w:hAnsi="Times New Roman" w:cs="Times New Roman"/>
-          <w:sz w:val="24"/>
-          <w:szCs w:val="24"/>
-        </w:rPr>
-        <w:t xml:space="preserve">Incluye las herramientas digitales y servicios de infraestructura en la nube proyectados. Como indica la rúbrica, los costos de Azure se basan en el análisis técnico de </w:t>
-      </w:r>
-      <w:proofErr w:type="spellStart"/>
-      <w:r>
-        <w:rPr>
-          <w:rFonts w:ascii="Times New Roman" w:eastAsia="Times New Roman" w:hAnsi="Times New Roman" w:cs="Times New Roman"/>
-          <w:sz w:val="24"/>
-          <w:szCs w:val="24"/>
-        </w:rPr>
-        <w:t>Terraform</w:t>
-      </w:r>
-      <w:proofErr w:type="spellEnd"/>
-      <w:r>
-        <w:rPr>
-          <w:rFonts w:ascii="Times New Roman" w:eastAsia="Times New Roman" w:hAnsi="Times New Roman" w:cs="Times New Roman"/>
-          <w:sz w:val="24"/>
-          <w:szCs w:val="24"/>
-        </w:rPr>
-        <w:t>.</w:t>
-      </w:r>
-    </w:p>
-    <w:p>
-      <w:bookmarkStart w:id="17" w:name="_heading=h.3dyv1t3n5k8d" w:colFirst="0" w:colLast="0"/>
-      <w:bookmarkEnd w:id="17"/>
-    </w:p>
-    <w:p>
-      <w:pPr>
         <w:pStyle w:val="Ttulo3"/>
         <w:spacing w:before="0" w:after="0" w:line="360" w:lineRule="auto"/>
         <w:jc w:val="both"/>
@@ -5977,15 +5934,8 @@
           <w:sz w:val="24"/>
           <w:szCs w:val="24"/>
         </w:rPr>
-        <w:t>4</w:t>
-      </w:r>
-      <w:r>
-        <w:rPr>
-          <w:rFonts w:ascii="Times New Roman" w:eastAsia="Times New Roman" w:hAnsi="Times New Roman" w:cs="Times New Roman"/>
-          <w:sz w:val="24"/>
-          <w:szCs w:val="24"/>
-        </w:rPr>
-        <w:t>.2.2 Costos de recursos humanos</w:t>
+        <w:lastRenderedPageBreak/>
+        <w:t>4.2.2 Costos de recursos humanos</w:t>
       </w:r>
     </w:p>
     <w:p>
@@ -6046,6 +5996,18 @@
     <w:p>
       <w:pPr>
         <w:spacing w:after="0" w:line="360" w:lineRule="auto"/>
+        <w:jc w:val="both"/>
+        <w:rPr>
+          <w:rFonts w:ascii="Times New Roman" w:eastAsia="Times New Roman" w:hAnsi="Times New Roman" w:cs="Times New Roman"/>
+          <w:sz w:val="24"/>
+          <w:szCs w:val="24"/>
+        </w:rPr>
+      </w:pPr>
+    </w:p>
+    <w:p>
+      <w:pPr>
+        <w:spacing w:after="0" w:line="360" w:lineRule="auto"/>
+        <w:ind w:left="2160"/>
         <w:jc w:val="both"/>
         <w:rPr>
           <w:rFonts w:ascii="Times New Roman" w:eastAsia="Times New Roman" w:hAnsi="Times New Roman" w:cs="Times New Roman"/>
@@ -6057,7 +6019,7 @@
     <w:sdt>
       <w:sdtPr>
         <w:tag w:val="goog_rdk_0"/>
-        <w:id w:val="-1511752442"/>
+        <w:id w:val="-1471233886"/>
         <w:lock w:val="contentLocked"/>
       </w:sdtPr>
       <w:sdtEndPr/>
@@ -7017,6 +6979,28 @@
     </w:sdt>
     <w:p>
       <w:pPr>
+        <w:spacing w:after="0" w:line="360" w:lineRule="auto"/>
+        <w:jc w:val="both"/>
+        <w:rPr>
+          <w:rFonts w:ascii="Times New Roman" w:eastAsia="Times New Roman" w:hAnsi="Times New Roman" w:cs="Times New Roman"/>
+          <w:sz w:val="24"/>
+          <w:szCs w:val="24"/>
+        </w:rPr>
+      </w:pPr>
+    </w:p>
+    <w:p>
+      <w:pPr>
+        <w:spacing w:after="0" w:line="360" w:lineRule="auto"/>
+        <w:jc w:val="both"/>
+        <w:rPr>
+          <w:rFonts w:ascii="Times New Roman" w:eastAsia="Times New Roman" w:hAnsi="Times New Roman" w:cs="Times New Roman"/>
+          <w:sz w:val="24"/>
+          <w:szCs w:val="24"/>
+        </w:rPr>
+      </w:pPr>
+    </w:p>
+    <w:p>
+      <w:pPr>
         <w:pStyle w:val="Ttulo3"/>
         <w:spacing w:before="0" w:after="0" w:line="360" w:lineRule="auto"/>
         <w:jc w:val="both"/>
@@ -7034,16 +7018,7 @@
           <w:sz w:val="24"/>
           <w:szCs w:val="24"/>
         </w:rPr>
-        <w:lastRenderedPageBreak/>
-        <w:t>4</w:t>
-      </w:r>
-      <w:r>
-        <w:rPr>
-          <w:rFonts w:ascii="Times New Roman" w:eastAsia="Times New Roman" w:hAnsi="Times New Roman" w:cs="Times New Roman"/>
-          <w:sz w:val="24"/>
-          <w:szCs w:val="24"/>
-        </w:rPr>
-        <w:t>.2.3 Costos generales de Administración</w:t>
+        <w:t>4.2.3 Costos generales de Administración</w:t>
       </w:r>
     </w:p>
     <w:p>
@@ -7068,6 +7043,18 @@
     <w:p>
       <w:pPr>
         <w:spacing w:after="0" w:line="360" w:lineRule="auto"/>
+        <w:jc w:val="both"/>
+        <w:rPr>
+          <w:rFonts w:ascii="Times New Roman" w:eastAsia="Times New Roman" w:hAnsi="Times New Roman" w:cs="Times New Roman"/>
+          <w:sz w:val="24"/>
+          <w:szCs w:val="24"/>
+        </w:rPr>
+      </w:pPr>
+    </w:p>
+    <w:p>
+      <w:pPr>
+        <w:spacing w:after="0" w:line="360" w:lineRule="auto"/>
+        <w:ind w:left="2160"/>
         <w:jc w:val="both"/>
         <w:rPr>
           <w:rFonts w:ascii="Times New Roman" w:eastAsia="Times New Roman" w:hAnsi="Times New Roman" w:cs="Times New Roman"/>
@@ -7091,7 +7078,7 @@
     <w:sdt>
       <w:sdtPr>
         <w:tag w:val="goog_rdk_1"/>
-        <w:id w:val="1117279858"/>
+        <w:id w:val="-476956742"/>
         <w:lock w:val="contentLocked"/>
       </w:sdtPr>
       <w:sdtEndPr/>
@@ -8068,15 +8055,8 @@
           <w:sz w:val="24"/>
           <w:szCs w:val="24"/>
         </w:rPr>
-        <w:t>4</w:t>
-      </w:r>
-      <w:r>
-        <w:rPr>
-          <w:rFonts w:ascii="Times New Roman" w:eastAsia="Times New Roman" w:hAnsi="Times New Roman" w:cs="Times New Roman"/>
-          <w:sz w:val="24"/>
-          <w:szCs w:val="24"/>
-        </w:rPr>
-        <w:t>.2.4 Tabla general de costos</w:t>
+        <w:lastRenderedPageBreak/>
+        <w:t>4.2.4 Tabla general de costos</w:t>
       </w:r>
     </w:p>
     <w:p>
@@ -8112,7 +8092,7 @@
     <w:sdt>
       <w:sdtPr>
         <w:tag w:val="goog_rdk_2"/>
-        <w:id w:val="-1714694459"/>
+        <w:id w:val="-40498062"/>
         <w:lock w:val="contentLocked"/>
       </w:sdtPr>
       <w:sdtEndPr/>
@@ -8654,10 +8634,6 @@
       <w:bookmarkStart w:id="28" w:name="_heading=h.7ne70d93ry03" w:colFirst="0" w:colLast="0"/>
       <w:bookmarkEnd w:id="28"/>
     </w:p>
-    <w:p/>
-    <w:p/>
-    <w:p/>
-    <w:p/>
     <w:p>
       <w:pPr>
         <w:pStyle w:val="Ttulo2"/>
@@ -8677,16 +8653,7 @@
           <w:sz w:val="24"/>
           <w:szCs w:val="24"/>
         </w:rPr>
-        <w:lastRenderedPageBreak/>
-        <w:t>4</w:t>
-      </w:r>
-      <w:r>
-        <w:rPr>
-          <w:rFonts w:ascii="Times New Roman" w:eastAsia="Times New Roman" w:hAnsi="Times New Roman" w:cs="Times New Roman"/>
-          <w:sz w:val="24"/>
-          <w:szCs w:val="24"/>
-        </w:rPr>
-        <w:t>.3 Factibilidad Operativa</w:t>
+        <w:t>4.3 Factibilidad Operativa</w:t>
       </w:r>
     </w:p>
     <w:p>
@@ -8832,113 +8799,6 @@
         </w:rPr>
         <w:t>ión de bases de datos externas adicionales o evoluciones en la capa de datos, con mínima afectación al sistema en funcionamiento.</w:t>
       </w:r>
-    </w:p>
-    <w:p>
-      <w:pPr>
-        <w:spacing w:after="0" w:line="360" w:lineRule="auto"/>
-        <w:jc w:val="both"/>
-        <w:rPr>
-          <w:rFonts w:ascii="Times New Roman" w:eastAsia="Times New Roman" w:hAnsi="Times New Roman" w:cs="Times New Roman"/>
-          <w:sz w:val="24"/>
-          <w:szCs w:val="24"/>
-        </w:rPr>
-      </w:pPr>
-    </w:p>
-    <w:p>
-      <w:pPr>
-        <w:spacing w:after="0" w:line="276" w:lineRule="auto"/>
-        <w:rPr>
-          <w:rFonts w:ascii="Arial" w:eastAsia="Arial" w:hAnsi="Arial" w:cs="Arial"/>
-        </w:rPr>
-      </w:pPr>
-    </w:p>
-    <w:p>
-      <w:pPr>
-        <w:spacing w:after="0" w:line="276" w:lineRule="auto"/>
-        <w:rPr>
-          <w:rFonts w:ascii="Arial" w:eastAsia="Arial" w:hAnsi="Arial" w:cs="Arial"/>
-        </w:rPr>
-      </w:pPr>
-    </w:p>
-    <w:p>
-      <w:pPr>
-        <w:spacing w:after="0" w:line="276" w:lineRule="auto"/>
-        <w:rPr>
-          <w:rFonts w:ascii="Arial" w:eastAsia="Arial" w:hAnsi="Arial" w:cs="Arial"/>
-        </w:rPr>
-      </w:pPr>
-    </w:p>
-    <w:p>
-      <w:pPr>
-        <w:spacing w:after="0" w:line="276" w:lineRule="auto"/>
-        <w:rPr>
-          <w:rFonts w:ascii="Arial" w:eastAsia="Arial" w:hAnsi="Arial" w:cs="Arial"/>
-        </w:rPr>
-      </w:pPr>
-    </w:p>
-    <w:p>
-      <w:pPr>
-        <w:spacing w:after="0" w:line="276" w:lineRule="auto"/>
-        <w:rPr>
-          <w:rFonts w:ascii="Arial" w:eastAsia="Arial" w:hAnsi="Arial" w:cs="Arial"/>
-        </w:rPr>
-      </w:pPr>
-    </w:p>
-    <w:p>
-      <w:pPr>
-        <w:spacing w:after="0" w:line="276" w:lineRule="auto"/>
-        <w:rPr>
-          <w:rFonts w:ascii="Arial" w:eastAsia="Arial" w:hAnsi="Arial" w:cs="Arial"/>
-        </w:rPr>
-      </w:pPr>
-    </w:p>
-    <w:p>
-      <w:pPr>
-        <w:spacing w:after="0" w:line="276" w:lineRule="auto"/>
-        <w:rPr>
-          <w:rFonts w:ascii="Arial" w:eastAsia="Arial" w:hAnsi="Arial" w:cs="Arial"/>
-        </w:rPr>
-      </w:pPr>
-    </w:p>
-    <w:p>
-      <w:pPr>
-        <w:spacing w:after="0" w:line="276" w:lineRule="auto"/>
-        <w:rPr>
-          <w:rFonts w:ascii="Arial" w:eastAsia="Arial" w:hAnsi="Arial" w:cs="Arial"/>
-        </w:rPr>
-      </w:pPr>
-    </w:p>
-    <w:p>
-      <w:pPr>
-        <w:spacing w:after="0" w:line="276" w:lineRule="auto"/>
-        <w:rPr>
-          <w:rFonts w:ascii="Arial" w:eastAsia="Arial" w:hAnsi="Arial" w:cs="Arial"/>
-        </w:rPr>
-      </w:pPr>
-    </w:p>
-    <w:p>
-      <w:pPr>
-        <w:spacing w:after="0" w:line="276" w:lineRule="auto"/>
-        <w:rPr>
-          <w:rFonts w:ascii="Arial" w:eastAsia="Arial" w:hAnsi="Arial" w:cs="Arial"/>
-        </w:rPr>
-      </w:pPr>
-    </w:p>
-    <w:p>
-      <w:pPr>
-        <w:spacing w:after="0" w:line="276" w:lineRule="auto"/>
-        <w:rPr>
-          <w:rFonts w:ascii="Arial" w:eastAsia="Arial" w:hAnsi="Arial" w:cs="Arial"/>
-        </w:rPr>
-      </w:pPr>
-    </w:p>
-    <w:p>
-      <w:pPr>
-        <w:spacing w:after="0" w:line="276" w:lineRule="auto"/>
-        <w:rPr>
-          <w:rFonts w:ascii="Arial" w:eastAsia="Arial" w:hAnsi="Arial" w:cs="Arial"/>
-        </w:rPr>
-      </w:pPr>
     </w:p>
     <w:p>
       <w:pPr>
@@ -8960,15 +8820,7 @@
           <w:szCs w:val="24"/>
         </w:rPr>
         <w:lastRenderedPageBreak/>
-        <w:t>4</w:t>
-      </w:r>
-      <w:r>
-        <w:rPr>
-          <w:rFonts w:ascii="Times New Roman" w:eastAsia="Times New Roman" w:hAnsi="Times New Roman" w:cs="Times New Roman"/>
-          <w:sz w:val="24"/>
-          <w:szCs w:val="24"/>
-        </w:rPr>
-        <w:t>.4 Factibilidad Legal</w:t>
+        <w:t>4.4 Factibilidad Legal</w:t>
       </w:r>
     </w:p>
     <w:p>
@@ -9132,15 +8984,7 @@
           <w:sz w:val="24"/>
           <w:szCs w:val="24"/>
         </w:rPr>
-        <w:t>4</w:t>
-      </w:r>
-      <w:r>
-        <w:rPr>
-          <w:rFonts w:ascii="Times New Roman" w:eastAsia="Times New Roman" w:hAnsi="Times New Roman" w:cs="Times New Roman"/>
-          <w:sz w:val="24"/>
-          <w:szCs w:val="24"/>
-        </w:rPr>
-        <w:t>.5 Factibilidad Social</w:t>
+        <w:t>4.5 Factibilidad Social</w:t>
       </w:r>
     </w:p>
     <w:p>
@@ -9209,15 +9053,7 @@
           <w:szCs w:val="24"/>
         </w:rPr>
         <w:lastRenderedPageBreak/>
-        <w:t>4</w:t>
-      </w:r>
-      <w:r>
-        <w:rPr>
-          <w:rFonts w:ascii="Times New Roman" w:eastAsia="Times New Roman" w:hAnsi="Times New Roman" w:cs="Times New Roman"/>
-          <w:sz w:val="24"/>
-          <w:szCs w:val="24"/>
-        </w:rPr>
-        <w:t>.6 Factibilidad Ambie</w:t>
+        <w:t>4.6 Factibilidad Ambie</w:t>
       </w:r>
       <w:r>
         <w:rPr>
@@ -9262,17 +9098,6 @@
         </w:rPr>
         <w:t>requieren refrigeración constante. Por lo tanto, el proyecto no solo es respetuoso con el medio ambiente, sino que también impulsa un cambio positivo hacia la digitalización sostenible de los recursos educativos.</w:t>
       </w:r>
-    </w:p>
-    <w:p>
-      <w:pPr>
-        <w:spacing w:after="0" w:line="360" w:lineRule="auto"/>
-        <w:jc w:val="both"/>
-        <w:rPr>
-          <w:rFonts w:ascii="Times New Roman" w:eastAsia="Times New Roman" w:hAnsi="Times New Roman" w:cs="Times New Roman"/>
-          <w:sz w:val="24"/>
-          <w:szCs w:val="24"/>
-        </w:rPr>
-      </w:pPr>
     </w:p>
     <w:p>
       <w:pPr>
@@ -9299,18 +9124,7 @@
           <w:sz w:val="24"/>
           <w:szCs w:val="24"/>
         </w:rPr>
-        <w:t>5</w:t>
-      </w:r>
-      <w:r>
-        <w:rPr>
-          <w:rFonts w:ascii="Times New Roman" w:eastAsia="Times New Roman" w:hAnsi="Times New Roman" w:cs="Times New Roman"/>
-          <w:b/>
-          <w:bCs/>
-          <w:color w:val="000000"/>
-          <w:sz w:val="24"/>
-          <w:szCs w:val="24"/>
-        </w:rPr>
-        <w:t>. Análisis Financiero</w:t>
+        <w:t>5. Análisis Financiero</w:t>
       </w:r>
     </w:p>
     <w:p>
@@ -9332,15 +9146,7 @@
           <w:sz w:val="24"/>
           <w:szCs w:val="24"/>
         </w:rPr>
-        <w:t>5</w:t>
-      </w:r>
-      <w:r>
-        <w:rPr>
-          <w:rFonts w:ascii="Times New Roman" w:eastAsia="Times New Roman" w:hAnsi="Times New Roman" w:cs="Times New Roman"/>
-          <w:sz w:val="24"/>
-          <w:szCs w:val="24"/>
-        </w:rPr>
-        <w:t>.1 Justificación de la Inversión</w:t>
+        <w:t>5.1 Justificación de la Inversión</w:t>
       </w:r>
     </w:p>
     <w:p>
@@ -9375,120 +9181,16 @@
           <w:sz w:val="24"/>
           <w:szCs w:val="24"/>
         </w:rPr>
-        <w:t xml:space="preserve">orno </w:t>
-      </w:r>
-      <w:proofErr w:type="spellStart"/>
-      <w:proofErr w:type="gramStart"/>
-      <w:r>
-        <w:rPr>
-          <w:rFonts w:ascii="Times New Roman" w:eastAsia="Times New Roman" w:hAnsi="Times New Roman" w:cs="Times New Roman"/>
-          <w:sz w:val="24"/>
-          <w:szCs w:val="24"/>
-        </w:rPr>
-        <w:t>digital.Esto</w:t>
-      </w:r>
-      <w:proofErr w:type="spellEnd"/>
-      <w:proofErr w:type="gramEnd"/>
-      <w:r>
-        <w:rPr>
-          <w:rFonts w:ascii="Times New Roman" w:eastAsia="Times New Roman" w:hAnsi="Times New Roman" w:cs="Times New Roman"/>
-          <w:sz w:val="24"/>
-          <w:szCs w:val="24"/>
-        </w:rPr>
-        <w:t xml:space="preserve"> facilitará la adopción de hábitos de investigación eficientes para estudiantes y docentes, de acuerdo con los objetivos estratégicos de transformación digital para la educación superior. Además, la integración de la infraestructura como c</w:t>
-      </w:r>
-      <w:r>
-        <w:rPr>
-          <w:rFonts w:ascii="Times New Roman" w:eastAsia="Times New Roman" w:hAnsi="Times New Roman" w:cs="Times New Roman"/>
-          <w:sz w:val="24"/>
-          <w:szCs w:val="24"/>
-        </w:rPr>
-        <w:t xml:space="preserve">ódigo mediante </w:t>
-      </w:r>
-      <w:proofErr w:type="spellStart"/>
-      <w:r>
-        <w:rPr>
-          <w:rFonts w:ascii="Times New Roman" w:eastAsia="Times New Roman" w:hAnsi="Times New Roman" w:cs="Times New Roman"/>
-          <w:sz w:val="24"/>
-          <w:szCs w:val="24"/>
-        </w:rPr>
-        <w:t>Terraform</w:t>
-      </w:r>
-      <w:proofErr w:type="spellEnd"/>
-      <w:r>
-        <w:rPr>
-          <w:rFonts w:ascii="Times New Roman" w:eastAsia="Times New Roman" w:hAnsi="Times New Roman" w:cs="Times New Roman"/>
-          <w:sz w:val="24"/>
-          <w:szCs w:val="24"/>
-        </w:rPr>
-        <w:t xml:space="preserve"> añade un valor significativo al proyecto, potenciando la transparencia en el gasto de nube y mejorando el rendimiento técnico y social de la inversión inicial.</w:t>
-      </w:r>
-    </w:p>
-    <w:p>
-      <w:pPr>
-        <w:spacing w:after="0" w:line="360" w:lineRule="auto"/>
-        <w:jc w:val="both"/>
-        <w:rPr>
-          <w:rFonts w:ascii="Times New Roman" w:eastAsia="Times New Roman" w:hAnsi="Times New Roman" w:cs="Times New Roman"/>
-          <w:sz w:val="24"/>
-          <w:szCs w:val="24"/>
-        </w:rPr>
-      </w:pPr>
-    </w:p>
-    <w:p>
-      <w:pPr>
-        <w:spacing w:after="0" w:line="360" w:lineRule="auto"/>
-        <w:jc w:val="both"/>
-        <w:rPr>
-          <w:rFonts w:ascii="Times New Roman" w:eastAsia="Times New Roman" w:hAnsi="Times New Roman" w:cs="Times New Roman"/>
-          <w:sz w:val="24"/>
-          <w:szCs w:val="24"/>
-        </w:rPr>
-      </w:pPr>
-    </w:p>
-    <w:p>
-      <w:pPr>
-        <w:spacing w:after="0" w:line="360" w:lineRule="auto"/>
-        <w:jc w:val="both"/>
-        <w:rPr>
-          <w:rFonts w:ascii="Times New Roman" w:eastAsia="Times New Roman" w:hAnsi="Times New Roman" w:cs="Times New Roman"/>
-          <w:sz w:val="24"/>
-          <w:szCs w:val="24"/>
-        </w:rPr>
-      </w:pPr>
-    </w:p>
-    <w:p>
-      <w:pPr>
-        <w:spacing w:after="0" w:line="360" w:lineRule="auto"/>
-        <w:jc w:val="both"/>
-        <w:rPr>
-          <w:rFonts w:ascii="Times New Roman" w:eastAsia="Times New Roman" w:hAnsi="Times New Roman" w:cs="Times New Roman"/>
-          <w:sz w:val="24"/>
-          <w:szCs w:val="24"/>
-        </w:rPr>
-      </w:pPr>
-    </w:p>
-    <w:p>
-      <w:pPr>
-        <w:spacing w:after="0" w:line="360" w:lineRule="auto"/>
-        <w:jc w:val="both"/>
-        <w:rPr>
-          <w:rFonts w:ascii="Times New Roman" w:eastAsia="Times New Roman" w:hAnsi="Times New Roman" w:cs="Times New Roman"/>
-          <w:sz w:val="24"/>
-          <w:szCs w:val="24"/>
-        </w:rPr>
-      </w:pPr>
-    </w:p>
-    <w:p>
-      <w:pPr>
-        <w:spacing w:after="0" w:line="360" w:lineRule="auto"/>
-        <w:jc w:val="both"/>
-        <w:rPr>
-          <w:rFonts w:ascii="Times New Roman" w:eastAsia="Times New Roman" w:hAnsi="Times New Roman" w:cs="Times New Roman"/>
-          <w:sz w:val="24"/>
-          <w:szCs w:val="24"/>
-        </w:rPr>
-      </w:pPr>
+        <w:t xml:space="preserve">orno digital. Esto facilitará la adopción de hábitos de investigación eficientes para estudiantes y docentes, de acuerdo con los objetivos estratégicos de transformación digital para la educación superior. Además, la implementación de un servidor dedicado </w:t>
+      </w:r>
+      <w:r>
+        <w:rPr>
+          <w:rFonts w:ascii="Times New Roman" w:eastAsia="Times New Roman" w:hAnsi="Times New Roman" w:cs="Times New Roman"/>
+          <w:sz w:val="24"/>
+          <w:szCs w:val="24"/>
+        </w:rPr>
+        <w:t>en la nube mediante una Máquina Virtual de Azure añade un valor definitivo al proyecto, potenciando el control directo de los servicios y mejorando el rendimiento técnico y operativo de la inversión inicial.</w:t>
+      </w:r>
     </w:p>
     <w:p>
       <w:pPr>
@@ -9509,16 +9211,7 @@
           <w:sz w:val="24"/>
           <w:szCs w:val="24"/>
         </w:rPr>
-        <w:lastRenderedPageBreak/>
-        <w:t>5</w:t>
-      </w:r>
-      <w:r>
-        <w:rPr>
-          <w:rFonts w:ascii="Times New Roman" w:eastAsia="Times New Roman" w:hAnsi="Times New Roman" w:cs="Times New Roman"/>
-          <w:sz w:val="24"/>
-          <w:szCs w:val="24"/>
-        </w:rPr>
-        <w:t>.1.1. Beneficios del proyecto</w:t>
+        <w:t>5.1.1. Beneficios del proyecto</w:t>
       </w:r>
     </w:p>
     <w:p>
@@ -9534,7 +9227,13 @@
         <w:rPr>
           <w:rFonts w:ascii="Times New Roman" w:eastAsia="Times New Roman" w:hAnsi="Times New Roman" w:cs="Times New Roman"/>
         </w:rPr>
-        <w:t>5.1.1.1 Beneficios tangibles</w:t>
+        <w:t>5.1.1.1 Beneficio</w:t>
+      </w:r>
+      <w:r>
+        <w:rPr>
+          <w:rFonts w:ascii="Times New Roman" w:eastAsia="Times New Roman" w:hAnsi="Times New Roman" w:cs="Times New Roman"/>
+        </w:rPr>
+        <w:t>s tangibles</w:t>
       </w:r>
     </w:p>
     <w:p>
@@ -9559,17 +9258,7 @@
           <w:sz w:val="24"/>
           <w:szCs w:val="24"/>
         </w:rPr>
-        <w:t>Reducción d</w:t>
-      </w:r>
-      <w:r>
-        <w:rPr>
-          <w:rFonts w:ascii="Times New Roman" w:eastAsia="Times New Roman" w:hAnsi="Times New Roman" w:cs="Times New Roman"/>
-          <w:b/>
-          <w:bCs/>
-          <w:sz w:val="24"/>
-          <w:szCs w:val="24"/>
-        </w:rPr>
-        <w:t>e costos operativos</w:t>
+        <w:t>Reducción de costos operativos</w:t>
       </w:r>
       <w:r>
         <w:rPr>
@@ -9651,25 +9340,16 @@
           <w:sz w:val="24"/>
           <w:szCs w:val="24"/>
         </w:rPr>
-        <w:t xml:space="preserve"> una solución en la nube con Azure y </w:t>
-      </w:r>
-      <w:proofErr w:type="spellStart"/>
-      <w:r>
-        <w:rPr>
-          <w:rFonts w:ascii="Times New Roman" w:eastAsia="Times New Roman" w:hAnsi="Times New Roman" w:cs="Times New Roman"/>
-          <w:sz w:val="24"/>
-          <w:szCs w:val="24"/>
-        </w:rPr>
-        <w:t>Terraform</w:t>
-      </w:r>
-      <w:proofErr w:type="spellEnd"/>
-      <w:r>
-        <w:rPr>
-          <w:rFonts w:ascii="Times New Roman" w:eastAsia="Times New Roman" w:hAnsi="Times New Roman" w:cs="Times New Roman"/>
-          <w:sz w:val="24"/>
-          <w:szCs w:val="24"/>
-        </w:rPr>
-        <w:t>, la institución evita grandes inversiones iniciales en servidores físicos locales, pagando únicamente por los recursos computacionales que realmente utiliza.</w:t>
+        <w:t xml:space="preserve"> una solución en la nube con una Máquina Virtual de Azure, la institución evita grandes inversiones </w:t>
+      </w:r>
+      <w:r>
+        <w:rPr>
+          <w:rFonts w:ascii="Times New Roman" w:eastAsia="Times New Roman" w:hAnsi="Times New Roman" w:cs="Times New Roman"/>
+          <w:sz w:val="24"/>
+          <w:szCs w:val="24"/>
+        </w:rPr>
+        <w:lastRenderedPageBreak/>
+        <w:t>iniciales en servidores físicos locales, pagando únicamente por los recursos computacionales que realmente utiliza.</w:t>
       </w:r>
     </w:p>
     <w:p>
@@ -9702,15 +9382,15 @@
           <w:sz w:val="24"/>
           <w:szCs w:val="24"/>
         </w:rPr>
-        <w:t>: La automatizac</w:t>
-      </w:r>
-      <w:r>
-        <w:rPr>
-          <w:rFonts w:ascii="Times New Roman" w:eastAsia="Times New Roman" w:hAnsi="Times New Roman" w:cs="Times New Roman"/>
-          <w:sz w:val="24"/>
-          <w:szCs w:val="24"/>
-        </w:rPr>
-        <w:t xml:space="preserve">ión de la disponibilidad de libros y acceso a </w:t>
+        <w:t xml:space="preserve">: La </w:t>
+      </w:r>
+      <w:r>
+        <w:rPr>
+          <w:rFonts w:ascii="Times New Roman" w:eastAsia="Times New Roman" w:hAnsi="Times New Roman" w:cs="Times New Roman"/>
+          <w:sz w:val="24"/>
+          <w:szCs w:val="24"/>
+        </w:rPr>
+        <w:t xml:space="preserve">automatización de la disponibilidad de libros y acceso a </w:t>
       </w:r>
       <w:proofErr w:type="spellStart"/>
       <w:r>
@@ -9769,7 +9449,7 @@
           <w:sz w:val="24"/>
           <w:szCs w:val="24"/>
         </w:rPr>
-        <w:t xml:space="preserve">Incremento en la motivación </w:t>
+        <w:t xml:space="preserve">Incremento en la </w:t>
       </w:r>
       <w:r>
         <w:rPr>
@@ -9779,7 +9459,7 @@
           <w:sz w:val="24"/>
           <w:szCs w:val="24"/>
         </w:rPr>
-        <w:t>académica</w:t>
+        <w:t>motivación académica</w:t>
       </w:r>
       <w:r>
         <w:rPr>
@@ -9812,23 +9492,25 @@
           <w:sz w:val="24"/>
           <w:szCs w:val="24"/>
         </w:rPr>
-        <w:t>Desarrollo de competencias digitales</w:t>
-      </w:r>
-      <w:r>
-        <w:rPr>
-          <w:rFonts w:ascii="Times New Roman" w:eastAsia="Times New Roman" w:hAnsi="Times New Roman" w:cs="Times New Roman"/>
-          <w:sz w:val="24"/>
-          <w:szCs w:val="24"/>
-        </w:rPr>
-        <w:t>: Grac</w:t>
-      </w:r>
-      <w:r>
-        <w:rPr>
-          <w:rFonts w:ascii="Times New Roman" w:eastAsia="Times New Roman" w:hAnsi="Times New Roman" w:cs="Times New Roman"/>
-          <w:sz w:val="24"/>
-          <w:szCs w:val="24"/>
-        </w:rPr>
-        <w:t>ias a esta herramienta, tanto docentes como estudiantes mejoran sus habilidades en el manejo de repositorios digitales y entornos de búsqueda avanzada.</w:t>
+        <w:t>Desarrollo de competencias digi</w:t>
+      </w:r>
+      <w:r>
+        <w:rPr>
+          <w:rFonts w:ascii="Times New Roman" w:eastAsia="Times New Roman" w:hAnsi="Times New Roman" w:cs="Times New Roman"/>
+          <w:b/>
+          <w:bCs/>
+          <w:sz w:val="24"/>
+          <w:szCs w:val="24"/>
+        </w:rPr>
+        <w:t>tales</w:t>
+      </w:r>
+      <w:r>
+        <w:rPr>
+          <w:rFonts w:ascii="Times New Roman" w:eastAsia="Times New Roman" w:hAnsi="Times New Roman" w:cs="Times New Roman"/>
+          <w:sz w:val="24"/>
+          <w:szCs w:val="24"/>
+        </w:rPr>
+        <w:t>: Gracias a esta herramienta, tanto docentes como estudiantes mejoran sus habilidades en el manejo de repositorios digitales y entornos de búsqueda avanzada.</w:t>
       </w:r>
     </w:p>
     <w:p>
@@ -9861,15 +9543,15 @@
           <w:sz w:val="24"/>
           <w:szCs w:val="24"/>
         </w:rPr>
-        <w:t>: La implementación de esta solución de vanguardia refuerza el</w:t>
-      </w:r>
-      <w:r>
-        <w:rPr>
-          <w:rFonts w:ascii="Times New Roman" w:eastAsia="Times New Roman" w:hAnsi="Times New Roman" w:cs="Times New Roman"/>
-          <w:sz w:val="24"/>
-          <w:szCs w:val="24"/>
-        </w:rPr>
-        <w:t xml:space="preserve"> compromiso de la universidad con la innovación tecnológica y la responsabilidad educativa, mejorando su percepción ante la comunidad y otras entidades.</w:t>
+        <w:t xml:space="preserve">: La implementación de esta solución de vanguardia </w:t>
+      </w:r>
+      <w:r>
+        <w:rPr>
+          <w:rFonts w:ascii="Times New Roman" w:eastAsia="Times New Roman" w:hAnsi="Times New Roman" w:cs="Times New Roman"/>
+          <w:sz w:val="24"/>
+          <w:szCs w:val="24"/>
+        </w:rPr>
+        <w:t>refuerza el compromiso de la universidad con la innovación tecnológica y la responsabilidad educativa, mejorando su percepción ante la comunidad y otras entidades.</w:t>
       </w:r>
     </w:p>
     <w:p>
@@ -9902,15 +9584,15 @@
           <w:sz w:val="24"/>
           <w:szCs w:val="24"/>
         </w:rPr>
-        <w:t>: El programa promueve un acceso democrático a la información, g</w:t>
-      </w:r>
-      <w:r>
-        <w:rPr>
-          <w:rFonts w:ascii="Times New Roman" w:eastAsia="Times New Roman" w:hAnsi="Times New Roman" w:cs="Times New Roman"/>
-          <w:sz w:val="24"/>
-          <w:szCs w:val="24"/>
-        </w:rPr>
-        <w:t>enerando un impacto positivo en la conciencia colectiva sobre la importancia de utilizar recursos bibliográficos validados y actualizados</w:t>
+        <w:t>: El programa promueve un acceso democrático a la inf</w:t>
+      </w:r>
+      <w:r>
+        <w:rPr>
+          <w:rFonts w:ascii="Times New Roman" w:eastAsia="Times New Roman" w:hAnsi="Times New Roman" w:cs="Times New Roman"/>
+          <w:sz w:val="24"/>
+          <w:szCs w:val="24"/>
+        </w:rPr>
+        <w:t>ormación, generando un impacto positivo en la conciencia colectiva sobre la importancia de utilizar recursos bibliográficos validados y actualizados</w:t>
       </w:r>
     </w:p>
     <w:p>
@@ -9943,16 +9625,7 @@
           <w:sz w:val="24"/>
           <w:szCs w:val="24"/>
         </w:rPr>
-        <w:lastRenderedPageBreak/>
-        <w:t>5</w:t>
-      </w:r>
-      <w:r>
-        <w:rPr>
-          <w:rFonts w:ascii="Times New Roman" w:eastAsia="Times New Roman" w:hAnsi="Times New Roman" w:cs="Times New Roman"/>
-          <w:sz w:val="24"/>
-          <w:szCs w:val="24"/>
-        </w:rPr>
-        <w:t>.1.2. Criterios de Inversión</w:t>
+        <w:t>5.1.2. Criterios de Inversión</w:t>
       </w:r>
     </w:p>
     <w:p>
@@ -9987,31 +9660,31 @@
           <w:sz w:val="24"/>
           <w:szCs w:val="24"/>
         </w:rPr>
-        <w:t>El costo inicial comprende todas las inversiones requeridas para</w:t>
-      </w:r>
-      <w:r>
-        <w:rPr>
-          <w:rFonts w:ascii="Times New Roman" w:eastAsia="Times New Roman" w:hAnsi="Times New Roman" w:cs="Times New Roman"/>
-          <w:sz w:val="24"/>
-          <w:szCs w:val="24"/>
-        </w:rPr>
-        <w:t xml:space="preserve"> poner en marcha el Sistema de Buscador Unificado antes de que se empiecen a generar valor o beneficios académicos. En el análisis financiero, la totalidad de la inversión, que asciende a S/ 9,540, se registra en el año 0 de la tabla de Flujo de Caja Neto </w:t>
-      </w:r>
-      <w:r>
-        <w:rPr>
-          <w:rFonts w:ascii="Times New Roman" w:eastAsia="Times New Roman" w:hAnsi="Times New Roman" w:cs="Times New Roman"/>
-          <w:sz w:val="24"/>
-          <w:szCs w:val="24"/>
-        </w:rPr>
-        <w:t>(FCN), lo que implica que dicho desembolso aparece como un flujo de salida inmediato. Este gasto es fundamental, ya que establece la base tecnológica (infraestructura en Azure y desarrollo de software) sobre la cual se recuperará la inversión a través de l</w:t>
-      </w:r>
-      <w:r>
-        <w:rPr>
-          <w:rFonts w:ascii="Times New Roman" w:eastAsia="Times New Roman" w:hAnsi="Times New Roman" w:cs="Times New Roman"/>
-          <w:sz w:val="24"/>
-          <w:szCs w:val="24"/>
-        </w:rPr>
-        <w:t>a optimización de procesos y ahorros proyectados.</w:t>
+        <w:t>El costo inicial comprende todas las inversiones requ</w:t>
+      </w:r>
+      <w:r>
+        <w:rPr>
+          <w:rFonts w:ascii="Times New Roman" w:eastAsia="Times New Roman" w:hAnsi="Times New Roman" w:cs="Times New Roman"/>
+          <w:sz w:val="24"/>
+          <w:szCs w:val="24"/>
+        </w:rPr>
+        <w:t>eridas para poner en marcha el Sistema de Buscador Unificado antes de que se empiecen a generar valor o beneficios académicos. En el análisis financiero, la totalidad de la inversión, que asciende a S/ 9,540, se registra en el año 0 de la tabla de Flujo de</w:t>
+      </w:r>
+      <w:r>
+        <w:rPr>
+          <w:rFonts w:ascii="Times New Roman" w:eastAsia="Times New Roman" w:hAnsi="Times New Roman" w:cs="Times New Roman"/>
+          <w:sz w:val="24"/>
+          <w:szCs w:val="24"/>
+        </w:rPr>
+        <w:t xml:space="preserve"> Caja Neto (FCN), lo que implica que dicho desembolso aparece como un flujo de salida inmediato. Este gasto es fundamental, ya que establece la base tecnológica (infraestructura en Azure y desarrollo de software) sobre la cual se recuperará la inversión a </w:t>
+      </w:r>
+      <w:r>
+        <w:rPr>
+          <w:rFonts w:ascii="Times New Roman" w:eastAsia="Times New Roman" w:hAnsi="Times New Roman" w:cs="Times New Roman"/>
+          <w:sz w:val="24"/>
+          <w:szCs w:val="24"/>
+        </w:rPr>
+        <w:t>través de la optimización de procesos y ahorros proyectados.</w:t>
       </w:r>
     </w:p>
     <w:p>
@@ -10038,6 +9711,7 @@
         <w:rPr>
           <w:rFonts w:ascii="Times New Roman" w:eastAsia="Times New Roman" w:hAnsi="Times New Roman" w:cs="Times New Roman"/>
         </w:rPr>
+        <w:lastRenderedPageBreak/>
         <w:t>5.1.2.2. Costo anual de operación</w:t>
       </w:r>
     </w:p>
@@ -10057,23 +9731,23 @@
           <w:sz w:val="24"/>
           <w:szCs w:val="24"/>
         </w:rPr>
-        <w:t>En la tabla de Flujos de Caja Neto (FCN), los costos se presentan de manera anual durante los primeros cinco años y se descuentan de los beneficios proyectados para calcul</w:t>
-      </w:r>
-      <w:r>
-        <w:rPr>
-          <w:rFonts w:ascii="Times New Roman" w:eastAsia="Times New Roman" w:hAnsi="Times New Roman" w:cs="Times New Roman"/>
-          <w:sz w:val="24"/>
-          <w:szCs w:val="24"/>
-        </w:rPr>
-        <w:t xml:space="preserve">ar el FCN correspondiente a cada período. Desde un punto de vista analítico, estos costos operativos disminuyen los flujos netos anuales, lo que afecta directamente el cálculo del VAN y la relación beneficio/costo. Un nivel de operación excesivamente alto </w:t>
-      </w:r>
-      <w:r>
-        <w:rPr>
-          <w:rFonts w:ascii="Times New Roman" w:eastAsia="Times New Roman" w:hAnsi="Times New Roman" w:cs="Times New Roman"/>
-          <w:sz w:val="24"/>
-          <w:szCs w:val="24"/>
-        </w:rPr>
-        <w:t>puede poner en riesgo la rentabilidad del proyecto, mientras que una gestión austera contribuye a tener indicadores financieros más sólidos.</w:t>
+        <w:t xml:space="preserve">En la tabla de Flujos de Caja Neto (FCN), los costos se presentan de manera anual durante los primeros cinco años y se descuentan de los beneficios proyectados </w:t>
+      </w:r>
+      <w:r>
+        <w:rPr>
+          <w:rFonts w:ascii="Times New Roman" w:eastAsia="Times New Roman" w:hAnsi="Times New Roman" w:cs="Times New Roman"/>
+          <w:sz w:val="24"/>
+          <w:szCs w:val="24"/>
+        </w:rPr>
+        <w:t>para calcular el FCN correspondiente a cada período. Desde un punto de vista analítico, estos costos operativos disminuyen los flujos netos anuales, lo que afecta directamente el cálculo del VAN y la relación beneficio/costo. Un nivel de operación excesiva</w:t>
+      </w:r>
+      <w:r>
+        <w:rPr>
+          <w:rFonts w:ascii="Times New Roman" w:eastAsia="Times New Roman" w:hAnsi="Times New Roman" w:cs="Times New Roman"/>
+          <w:sz w:val="24"/>
+          <w:szCs w:val="24"/>
+        </w:rPr>
+        <w:t>mente alto puede poner en riesgo la rentabilidad del proyecto, mientras que una gestión austera contribuye a tener indicadores financieros más sólidos.</w:t>
       </w:r>
     </w:p>
     <w:p>
@@ -10119,23 +9793,23 @@
           <w:sz w:val="24"/>
           <w:szCs w:val="24"/>
         </w:rPr>
-        <w:t>El tiempo de elaboración es el lapso que transcurre desde el inicio del proyecto has</w:t>
-      </w:r>
-      <w:r>
-        <w:rPr>
-          <w:rFonts w:ascii="Times New Roman" w:eastAsia="Times New Roman" w:hAnsi="Times New Roman" w:cs="Times New Roman"/>
-          <w:sz w:val="24"/>
-          <w:szCs w:val="24"/>
-        </w:rPr>
-        <w:t>ta que la plataforma unificada está lista para su fase piloto o atención a los primeros usuarios. El proyecto tiene un tiempo estimado de 3 meses para la completa elaboración, pruebas de integración de recursos físicos/digitales y puesta en marcha final de</w:t>
-      </w:r>
-      <w:r>
-        <w:rPr>
-          <w:rFonts w:ascii="Times New Roman" w:eastAsia="Times New Roman" w:hAnsi="Times New Roman" w:cs="Times New Roman"/>
-          <w:sz w:val="24"/>
-          <w:szCs w:val="24"/>
-        </w:rPr>
-        <w:t>l sistema.</w:t>
+        <w:t>El tiempo de elaboración es el lapso que transcurre desde el inicio del p</w:t>
+      </w:r>
+      <w:r>
+        <w:rPr>
+          <w:rFonts w:ascii="Times New Roman" w:eastAsia="Times New Roman" w:hAnsi="Times New Roman" w:cs="Times New Roman"/>
+          <w:sz w:val="24"/>
+          <w:szCs w:val="24"/>
+        </w:rPr>
+        <w:t>royecto hasta que la plataforma unificada está lista para su fase piloto o atención a los primeros usuarios. El proyecto tiene un tiempo estimado de 3 meses para la completa elaboración, pruebas de integración de recursos físicos/digitales y puesta en marc</w:t>
+      </w:r>
+      <w:r>
+        <w:rPr>
+          <w:rFonts w:ascii="Times New Roman" w:eastAsia="Times New Roman" w:hAnsi="Times New Roman" w:cs="Times New Roman"/>
+          <w:sz w:val="24"/>
+          <w:szCs w:val="24"/>
+        </w:rPr>
+        <w:t>ha final del sistema.</w:t>
       </w:r>
     </w:p>
     <w:p>
@@ -10194,17 +9868,6 @@
     </w:p>
     <w:p>
       <w:pPr>
-        <w:spacing w:after="0" w:line="360" w:lineRule="auto"/>
-        <w:jc w:val="both"/>
-        <w:rPr>
-          <w:rFonts w:ascii="Times New Roman" w:eastAsia="Times New Roman" w:hAnsi="Times New Roman" w:cs="Times New Roman"/>
-          <w:sz w:val="24"/>
-          <w:szCs w:val="24"/>
-        </w:rPr>
-      </w:pPr>
-    </w:p>
-    <w:p>
-      <w:pPr>
         <w:spacing w:line="360" w:lineRule="auto"/>
         <w:jc w:val="both"/>
         <w:rPr>
@@ -10221,7 +9884,6 @@
           <w:sz w:val="24"/>
           <w:szCs w:val="24"/>
         </w:rPr>
-        <w:lastRenderedPageBreak/>
         <w:t>Inversión:</w:t>
       </w:r>
       <w:r>
@@ -10280,7 +9942,7 @@
           <w:szCs w:val="24"/>
         </w:rPr>
         <w:drawing>
-          <wp:inline distT="114300" distB="114300" distL="114300" distR="114300" wp14:anchorId="10AC8733" wp14:editId="45CB761C">
+          <wp:inline distT="114300" distB="114300" distL="114300" distR="114300" wp14:anchorId="4EFBE128" wp14:editId="2FF9A5C8">
             <wp:extent cx="3725055" cy="1594825"/>
             <wp:effectExtent l="0" t="0" r="0" b="0"/>
             <wp:docPr id="2" name="image2.png"/>
@@ -10325,6 +9987,16 @@
           <w:rFonts w:ascii="Times New Roman" w:eastAsia="Times New Roman" w:hAnsi="Times New Roman" w:cs="Times New Roman"/>
         </w:rPr>
       </w:pPr>
+    </w:p>
+    <w:p>
+      <w:pPr>
+        <w:pStyle w:val="Ttulo4"/>
+        <w:spacing w:before="0" w:after="0" w:line="360" w:lineRule="auto"/>
+        <w:jc w:val="both"/>
+        <w:rPr>
+          <w:rFonts w:ascii="Times New Roman" w:eastAsia="Times New Roman" w:hAnsi="Times New Roman" w:cs="Times New Roman"/>
+        </w:rPr>
+      </w:pPr>
       <w:r>
         <w:rPr>
           <w:rFonts w:ascii="Times New Roman" w:eastAsia="Times New Roman" w:hAnsi="Times New Roman" w:cs="Times New Roman"/>
@@ -10335,7 +10007,7 @@
     <w:sdt>
       <w:sdtPr>
         <w:tag w:val="goog_rdk_3"/>
-        <w:id w:val="-292732179"/>
+        <w:id w:val="-418688004"/>
         <w:lock w:val="contentLocked"/>
       </w:sdtPr>
       <w:sdtEndPr/>
@@ -10509,7 +10181,7 @@
     <w:sdt>
       <w:sdtPr>
         <w:tag w:val="goog_rdk_4"/>
-        <w:id w:val="1793120492"/>
+        <w:id w:val="1144509156"/>
         <w:lock w:val="contentLocked"/>
       </w:sdtPr>
       <w:sdtEndPr/>
@@ -10665,7 +10337,7 @@
     <w:sdt>
       <w:sdtPr>
         <w:tag w:val="goog_rdk_5"/>
-        <w:id w:val="341033240"/>
+        <w:id w:val="-406932719"/>
         <w:lock w:val="contentLocked"/>
       </w:sdtPr>
       <w:sdtEndPr/>
@@ -10790,39 +10462,6 @@
     </w:p>
     <w:p>
       <w:pPr>
-        <w:spacing w:line="360" w:lineRule="auto"/>
-        <w:jc w:val="both"/>
-        <w:rPr>
-          <w:rFonts w:ascii="Times New Roman" w:eastAsia="Times New Roman" w:hAnsi="Times New Roman" w:cs="Times New Roman"/>
-          <w:sz w:val="24"/>
-          <w:szCs w:val="24"/>
-        </w:rPr>
-      </w:pPr>
-    </w:p>
-    <w:p>
-      <w:pPr>
-        <w:spacing w:line="360" w:lineRule="auto"/>
-        <w:jc w:val="both"/>
-        <w:rPr>
-          <w:rFonts w:ascii="Times New Roman" w:eastAsia="Times New Roman" w:hAnsi="Times New Roman" w:cs="Times New Roman"/>
-          <w:sz w:val="24"/>
-          <w:szCs w:val="24"/>
-        </w:rPr>
-      </w:pPr>
-    </w:p>
-    <w:p>
-      <w:pPr>
-        <w:spacing w:line="360" w:lineRule="auto"/>
-        <w:jc w:val="both"/>
-        <w:rPr>
-          <w:rFonts w:ascii="Times New Roman" w:eastAsia="Times New Roman" w:hAnsi="Times New Roman" w:cs="Times New Roman"/>
-          <w:sz w:val="24"/>
-          <w:szCs w:val="24"/>
-        </w:rPr>
-      </w:pPr>
-    </w:p>
-    <w:p>
-      <w:pPr>
         <w:pStyle w:val="Ttulo1"/>
         <w:spacing w:before="0" w:line="360" w:lineRule="auto"/>
         <w:jc w:val="both"/>
@@ -10846,19 +10485,7 @@
           <w:sz w:val="24"/>
           <w:szCs w:val="24"/>
         </w:rPr>
-        <w:lastRenderedPageBreak/>
-        <w:t>6</w:t>
-      </w:r>
-      <w:r>
-        <w:rPr>
-          <w:rFonts w:ascii="Times New Roman" w:eastAsia="Times New Roman" w:hAnsi="Times New Roman" w:cs="Times New Roman"/>
-          <w:b/>
-          <w:bCs/>
-          <w:color w:val="000000"/>
-          <w:sz w:val="24"/>
-          <w:szCs w:val="24"/>
-        </w:rPr>
-        <w:t>. Co</w:t>
+        <w:t>6. Co</w:t>
       </w:r>
       <w:r>
         <w:rPr>
@@ -11039,25 +10666,7 @@
           <w:sz w:val="24"/>
           <w:szCs w:val="24"/>
         </w:rPr>
-        <w:t xml:space="preserve">mite una gestión eficiente de los recursos institucionales, priorizando la inversión en infraestructura de nube gestionada por </w:t>
-      </w:r>
-      <w:proofErr w:type="spellStart"/>
-      <w:r>
-        <w:rPr>
-          <w:rFonts w:ascii="Times New Roman" w:eastAsia="Times New Roman" w:hAnsi="Times New Roman" w:cs="Times New Roman"/>
-          <w:sz w:val="24"/>
-          <w:szCs w:val="24"/>
-        </w:rPr>
-        <w:t>Terraform</w:t>
-      </w:r>
-      <w:proofErr w:type="spellEnd"/>
-      <w:r>
-        <w:rPr>
-          <w:rFonts w:ascii="Times New Roman" w:eastAsia="Times New Roman" w:hAnsi="Times New Roman" w:cs="Times New Roman"/>
-          <w:sz w:val="24"/>
-          <w:szCs w:val="24"/>
-        </w:rPr>
-        <w:t xml:space="preserve"> y el talento humano.</w:t>
+        <w:t>mite una gestión eficiente de los recursos institucionales, priorizando la inversión en la infraestructura del servidor dedicado en la nube y el talento humano.</w:t>
       </w:r>
     </w:p>
     <w:p>
@@ -11080,15 +10689,16 @@
           <w:sz w:val="24"/>
           <w:szCs w:val="24"/>
         </w:rPr>
-        <w:t>El sistema representa una oportunidad real de modernización académica, permitiendo a estudiantes y</w:t>
-      </w:r>
-      <w:r>
-        <w:rPr>
-          <w:rFonts w:ascii="Times New Roman" w:eastAsia="Times New Roman" w:hAnsi="Times New Roman" w:cs="Times New Roman"/>
-          <w:sz w:val="24"/>
-          <w:szCs w:val="24"/>
-        </w:rPr>
-        <w:t xml:space="preserve"> docentes acceder de manera eficiente a la totalidad de la oferta bibliográfica de la institución mediante la unificación de catálogos físicos y digitales en una sola interfaz.</w:t>
+        <w:lastRenderedPageBreak/>
+        <w:t>El sistema representa una oportunidad real de modernización académica, permitiendo a estudiante</w:t>
+      </w:r>
+      <w:r>
+        <w:rPr>
+          <w:rFonts w:ascii="Times New Roman" w:eastAsia="Times New Roman" w:hAnsi="Times New Roman" w:cs="Times New Roman"/>
+          <w:sz w:val="24"/>
+          <w:szCs w:val="24"/>
+        </w:rPr>
+        <w:t>s y docentes acceder de manera eficiente a la totalidad de la oferta bibliográfica de la institución mediante la unificación de catálogos físicos y digitales en una sola interfaz.</w:t>
       </w:r>
     </w:p>
     <w:p>
@@ -11111,15 +10721,15 @@
           <w:sz w:val="24"/>
           <w:szCs w:val="24"/>
         </w:rPr>
-        <w:t>En conjunto, el proyecto se presenta como una solución tecnológica sólida con u</w:t>
-      </w:r>
-      <w:r>
-        <w:rPr>
-          <w:rFonts w:ascii="Times New Roman" w:eastAsia="Times New Roman" w:hAnsi="Times New Roman" w:cs="Times New Roman"/>
-          <w:sz w:val="24"/>
-          <w:szCs w:val="24"/>
-        </w:rPr>
-        <w:t>n alto impacto social y educativo, alineada con las metas de transformación digital de la facultad y las exigencias técnicas actuales.</w:t>
+        <w:t>En conjunto, el proyecto se presenta como una solución tecnológica sólida co</w:t>
+      </w:r>
+      <w:r>
+        <w:rPr>
+          <w:rFonts w:ascii="Times New Roman" w:eastAsia="Times New Roman" w:hAnsi="Times New Roman" w:cs="Times New Roman"/>
+          <w:sz w:val="24"/>
+          <w:szCs w:val="24"/>
+        </w:rPr>
+        <w:t>n un alto impacto social y educativo, alineada con las metas de transformación digital de la facultad y las exigencias técnicas actuales.</w:t>
       </w:r>
     </w:p>
     <w:sectPr>
@@ -11299,348 +10909,9 @@
 <file path=word/numbering.xml><?xml version="1.0" encoding="utf-8"?>
 <w:numbering xmlns:wpc="http://schemas.microsoft.com/office/word/2010/wordprocessingCanvas" xmlns:cx="http://schemas.microsoft.com/office/drawing/2014/chartex" xmlns:cx1="http://schemas.microsoft.com/office/drawing/2015/9/8/chartex" xmlns:cx2="http://schemas.microsoft.com/office/drawing/2015/10/21/chartex" xmlns:cx3="http://schemas.microsoft.com/office/drawing/2016/5/9/chartex" xmlns:cx4="http://schemas.microsoft.com/office/drawing/2016/5/10/chartex" xmlns:cx5="http://schemas.microsoft.com/office/drawing/2016/5/11/chartex" xmlns:cx6="http://schemas.microsoft.com/office/drawing/2016/5/12/chartex" xmlns:cx7="http://schemas.microsoft.com/office/drawing/2016/5/13/chartex" xmlns:cx8="http://schemas.microsoft.com/office/drawing/2016/5/14/chartex" xmlns:mc="http://schemas.openxmlformats.org/markup-compatibility/2006" xmlns:aink="http://schemas.microsoft.com/office/drawing/2016/ink" xmlns:am3d="http://schemas.microsoft.com/office/drawing/2017/model3d" xmlns:o="urn:schemas-microsoft-com:office:office" xmlns:r="http://schemas.openxmlformats.org/officeDocument/2006/relationships" xmlns:m="http://schemas.openxmlformats.org/officeDocument/2006/math" xmlns:v="urn:schemas-microsoft-com:vml" xmlns:wp14="http://schemas.microsoft.com/office/word/2010/wordprocessingDrawing" xmlns:wp="http://schemas.openxmlformats.org/drawingml/2006/wordprocessingDrawing" xmlns:w10="urn:schemas-microsoft-com:office:word" xmlns:w="http://schemas.openxmlformats.org/wordprocessingml/2006/main" xmlns:w14="http://schemas.microsoft.com/office/word/2010/wordml" xmlns:w15="http://schemas.microsoft.com/office/word/2012/wordml" xmlns:w16cex="http://schemas.microsoft.com/office/word/2018/wordml/cex" xmlns:w16cid="http://schemas.microsoft.com/office/word/2016/wordml/cid" xmlns:w16="http://schemas.microsoft.com/office/word/2018/wordml" xmlns:w16sdtdh="http://schemas.microsoft.com/office/word/2020/wordml/sdtdatahash" xmlns:w16se="http://schemas.microsoft.com/office/word/2015/wordml/symex" xmlns:wpg="http://schemas.microsoft.com/office/word/2010/wordprocessingGroup" xmlns:wpi="http://schemas.microsoft.com/office/word/2010/wordprocessingInk" xmlns:wne="http://schemas.microsoft.com/office/word/2006/wordml" xmlns:wps="http://schemas.microsoft.com/office/word/2010/wordprocessingShape" mc:Ignorable="w14 w15 w16se w16cid w16 w16cex w16sdtdh wp14">
   <w:abstractNum w:abstractNumId="0" w15:restartNumberingAfterBreak="0">
-    <w:nsid w:val="03477206"/>
+    <w:nsid w:val="016F1D3E"/>
     <w:multiLevelType w:val="multilevel"/>
-    <w:tmpl w:val="2124D996"/>
-    <w:lvl w:ilvl="0">
-      <w:start w:val="1"/>
-      <w:numFmt w:val="bullet"/>
-      <w:lvlText w:val="●"/>
-      <w:lvlJc w:val="left"/>
-      <w:pPr>
-        <w:ind w:left="720" w:hanging="360"/>
-      </w:pPr>
-      <w:rPr>
-        <w:u w:val="none"/>
-      </w:rPr>
-    </w:lvl>
-    <w:lvl w:ilvl="1">
-      <w:start w:val="1"/>
-      <w:numFmt w:val="bullet"/>
-      <w:lvlText w:val="○"/>
-      <w:lvlJc w:val="left"/>
-      <w:pPr>
-        <w:ind w:left="1440" w:hanging="360"/>
-      </w:pPr>
-      <w:rPr>
-        <w:u w:val="none"/>
-      </w:rPr>
-    </w:lvl>
-    <w:lvl w:ilvl="2">
-      <w:start w:val="1"/>
-      <w:numFmt w:val="bullet"/>
-      <w:lvlText w:val="■"/>
-      <w:lvlJc w:val="left"/>
-      <w:pPr>
-        <w:ind w:left="2160" w:hanging="360"/>
-      </w:pPr>
-      <w:rPr>
-        <w:u w:val="none"/>
-      </w:rPr>
-    </w:lvl>
-    <w:lvl w:ilvl="3">
-      <w:start w:val="1"/>
-      <w:numFmt w:val="bullet"/>
-      <w:lvlText w:val="●"/>
-      <w:lvlJc w:val="left"/>
-      <w:pPr>
-        <w:ind w:left="2880" w:hanging="360"/>
-      </w:pPr>
-      <w:rPr>
-        <w:u w:val="none"/>
-      </w:rPr>
-    </w:lvl>
-    <w:lvl w:ilvl="4">
-      <w:start w:val="1"/>
-      <w:numFmt w:val="bullet"/>
-      <w:lvlText w:val="○"/>
-      <w:lvlJc w:val="left"/>
-      <w:pPr>
-        <w:ind w:left="3600" w:hanging="360"/>
-      </w:pPr>
-      <w:rPr>
-        <w:u w:val="none"/>
-      </w:rPr>
-    </w:lvl>
-    <w:lvl w:ilvl="5">
-      <w:start w:val="1"/>
-      <w:numFmt w:val="bullet"/>
-      <w:lvlText w:val="■"/>
-      <w:lvlJc w:val="left"/>
-      <w:pPr>
-        <w:ind w:left="4320" w:hanging="360"/>
-      </w:pPr>
-      <w:rPr>
-        <w:u w:val="none"/>
-      </w:rPr>
-    </w:lvl>
-    <w:lvl w:ilvl="6">
-      <w:start w:val="1"/>
-      <w:numFmt w:val="bullet"/>
-      <w:lvlText w:val="●"/>
-      <w:lvlJc w:val="left"/>
-      <w:pPr>
-        <w:ind w:left="5040" w:hanging="360"/>
-      </w:pPr>
-      <w:rPr>
-        <w:u w:val="none"/>
-      </w:rPr>
-    </w:lvl>
-    <w:lvl w:ilvl="7">
-      <w:start w:val="1"/>
-      <w:numFmt w:val="bullet"/>
-      <w:lvlText w:val="○"/>
-      <w:lvlJc w:val="left"/>
-      <w:pPr>
-        <w:ind w:left="5760" w:hanging="360"/>
-      </w:pPr>
-      <w:rPr>
-        <w:u w:val="none"/>
-      </w:rPr>
-    </w:lvl>
-    <w:lvl w:ilvl="8">
-      <w:start w:val="1"/>
-      <w:numFmt w:val="bullet"/>
-      <w:lvlText w:val="■"/>
-      <w:lvlJc w:val="left"/>
-      <w:pPr>
-        <w:ind w:left="6480" w:hanging="360"/>
-      </w:pPr>
-      <w:rPr>
-        <w:u w:val="none"/>
-      </w:rPr>
-    </w:lvl>
-  </w:abstractNum>
-  <w:abstractNum w:abstractNumId="1" w15:restartNumberingAfterBreak="0">
-    <w:nsid w:val="11A7742E"/>
-    <w:multiLevelType w:val="multilevel"/>
-    <w:tmpl w:val="A5425E3E"/>
-    <w:lvl w:ilvl="0">
-      <w:start w:val="1"/>
-      <w:numFmt w:val="bullet"/>
-      <w:lvlText w:val="●"/>
-      <w:lvlJc w:val="left"/>
-      <w:pPr>
-        <w:ind w:left="1080" w:hanging="360"/>
-      </w:pPr>
-      <w:rPr>
-        <w:u w:val="none"/>
-      </w:rPr>
-    </w:lvl>
-    <w:lvl w:ilvl="1">
-      <w:start w:val="1"/>
-      <w:numFmt w:val="bullet"/>
-      <w:lvlText w:val="○"/>
-      <w:lvlJc w:val="left"/>
-      <w:pPr>
-        <w:ind w:left="1800" w:hanging="360"/>
-      </w:pPr>
-      <w:rPr>
-        <w:u w:val="none"/>
-      </w:rPr>
-    </w:lvl>
-    <w:lvl w:ilvl="2">
-      <w:start w:val="1"/>
-      <w:numFmt w:val="bullet"/>
-      <w:lvlText w:val="■"/>
-      <w:lvlJc w:val="left"/>
-      <w:pPr>
-        <w:ind w:left="2520" w:hanging="360"/>
-      </w:pPr>
-      <w:rPr>
-        <w:u w:val="none"/>
-      </w:rPr>
-    </w:lvl>
-    <w:lvl w:ilvl="3">
-      <w:start w:val="1"/>
-      <w:numFmt w:val="bullet"/>
-      <w:lvlText w:val="●"/>
-      <w:lvlJc w:val="left"/>
-      <w:pPr>
-        <w:ind w:left="3240" w:hanging="360"/>
-      </w:pPr>
-      <w:rPr>
-        <w:u w:val="none"/>
-      </w:rPr>
-    </w:lvl>
-    <w:lvl w:ilvl="4">
-      <w:start w:val="1"/>
-      <w:numFmt w:val="bullet"/>
-      <w:lvlText w:val="○"/>
-      <w:lvlJc w:val="left"/>
-      <w:pPr>
-        <w:ind w:left="3960" w:hanging="360"/>
-      </w:pPr>
-      <w:rPr>
-        <w:u w:val="none"/>
-      </w:rPr>
-    </w:lvl>
-    <w:lvl w:ilvl="5">
-      <w:start w:val="1"/>
-      <w:numFmt w:val="bullet"/>
-      <w:lvlText w:val="■"/>
-      <w:lvlJc w:val="left"/>
-      <w:pPr>
-        <w:ind w:left="4680" w:hanging="360"/>
-      </w:pPr>
-      <w:rPr>
-        <w:u w:val="none"/>
-      </w:rPr>
-    </w:lvl>
-    <w:lvl w:ilvl="6">
-      <w:start w:val="1"/>
-      <w:numFmt w:val="bullet"/>
-      <w:lvlText w:val="●"/>
-      <w:lvlJc w:val="left"/>
-      <w:pPr>
-        <w:ind w:left="5400" w:hanging="360"/>
-      </w:pPr>
-      <w:rPr>
-        <w:u w:val="none"/>
-      </w:rPr>
-    </w:lvl>
-    <w:lvl w:ilvl="7">
-      <w:start w:val="1"/>
-      <w:numFmt w:val="bullet"/>
-      <w:lvlText w:val="○"/>
-      <w:lvlJc w:val="left"/>
-      <w:pPr>
-        <w:ind w:left="6120" w:hanging="360"/>
-      </w:pPr>
-      <w:rPr>
-        <w:u w:val="none"/>
-      </w:rPr>
-    </w:lvl>
-    <w:lvl w:ilvl="8">
-      <w:start w:val="1"/>
-      <w:numFmt w:val="bullet"/>
-      <w:lvlText w:val="■"/>
-      <w:lvlJc w:val="left"/>
-      <w:pPr>
-        <w:ind w:left="6840" w:hanging="360"/>
-      </w:pPr>
-      <w:rPr>
-        <w:u w:val="none"/>
-      </w:rPr>
-    </w:lvl>
-  </w:abstractNum>
-  <w:abstractNum w:abstractNumId="2" w15:restartNumberingAfterBreak="0">
-    <w:nsid w:val="2B52371A"/>
-    <w:multiLevelType w:val="multilevel"/>
-    <w:tmpl w:val="360E104C"/>
-    <w:lvl w:ilvl="0">
-      <w:start w:val="1"/>
-      <w:numFmt w:val="bullet"/>
-      <w:lvlText w:val="●"/>
-      <w:lvlJc w:val="left"/>
-      <w:pPr>
-        <w:ind w:left="1080" w:hanging="360"/>
-      </w:pPr>
-      <w:rPr>
-        <w:u w:val="none"/>
-      </w:rPr>
-    </w:lvl>
-    <w:lvl w:ilvl="1">
-      <w:start w:val="1"/>
-      <w:numFmt w:val="bullet"/>
-      <w:lvlText w:val="○"/>
-      <w:lvlJc w:val="left"/>
-      <w:pPr>
-        <w:ind w:left="1800" w:hanging="360"/>
-      </w:pPr>
-      <w:rPr>
-        <w:u w:val="none"/>
-      </w:rPr>
-    </w:lvl>
-    <w:lvl w:ilvl="2">
-      <w:start w:val="1"/>
-      <w:numFmt w:val="bullet"/>
-      <w:lvlText w:val="■"/>
-      <w:lvlJc w:val="left"/>
-      <w:pPr>
-        <w:ind w:left="2520" w:hanging="360"/>
-      </w:pPr>
-      <w:rPr>
-        <w:u w:val="none"/>
-      </w:rPr>
-    </w:lvl>
-    <w:lvl w:ilvl="3">
-      <w:start w:val="1"/>
-      <w:numFmt w:val="bullet"/>
-      <w:lvlText w:val="●"/>
-      <w:lvlJc w:val="left"/>
-      <w:pPr>
-        <w:ind w:left="3240" w:hanging="360"/>
-      </w:pPr>
-      <w:rPr>
-        <w:u w:val="none"/>
-      </w:rPr>
-    </w:lvl>
-    <w:lvl w:ilvl="4">
-      <w:start w:val="1"/>
-      <w:numFmt w:val="bullet"/>
-      <w:lvlText w:val="○"/>
-      <w:lvlJc w:val="left"/>
-      <w:pPr>
-        <w:ind w:left="3960" w:hanging="360"/>
-      </w:pPr>
-      <w:rPr>
-        <w:u w:val="none"/>
-      </w:rPr>
-    </w:lvl>
-    <w:lvl w:ilvl="5">
-      <w:start w:val="1"/>
-      <w:numFmt w:val="bullet"/>
-      <w:lvlText w:val="■"/>
-      <w:lvlJc w:val="left"/>
-      <w:pPr>
-        <w:ind w:left="4680" w:hanging="360"/>
-      </w:pPr>
-      <w:rPr>
-        <w:u w:val="none"/>
-      </w:rPr>
-    </w:lvl>
-    <w:lvl w:ilvl="6">
-      <w:start w:val="1"/>
-      <w:numFmt w:val="bullet"/>
-      <w:lvlText w:val="●"/>
-      <w:lvlJc w:val="left"/>
-      <w:pPr>
-        <w:ind w:left="5400" w:hanging="360"/>
-      </w:pPr>
-      <w:rPr>
-        <w:u w:val="none"/>
-      </w:rPr>
-    </w:lvl>
-    <w:lvl w:ilvl="7">
-      <w:start w:val="1"/>
-      <w:numFmt w:val="bullet"/>
-      <w:lvlText w:val="○"/>
-      <w:lvlJc w:val="left"/>
-      <w:pPr>
-        <w:ind w:left="6120" w:hanging="360"/>
-      </w:pPr>
-      <w:rPr>
-        <w:u w:val="none"/>
-      </w:rPr>
-    </w:lvl>
-    <w:lvl w:ilvl="8">
-      <w:start w:val="1"/>
-      <w:numFmt w:val="bullet"/>
-      <w:lvlText w:val="■"/>
-      <w:lvlJc w:val="left"/>
-      <w:pPr>
-        <w:ind w:left="6840" w:hanging="360"/>
-      </w:pPr>
-      <w:rPr>
-        <w:u w:val="none"/>
-      </w:rPr>
-    </w:lvl>
-  </w:abstractNum>
-  <w:abstractNum w:abstractNumId="3" w15:restartNumberingAfterBreak="0">
-    <w:nsid w:val="311F35D7"/>
-    <w:multiLevelType w:val="multilevel"/>
-    <w:tmpl w:val="86724998"/>
+    <w:tmpl w:val="32EE34F4"/>
     <w:lvl w:ilvl="0">
       <w:start w:val="1"/>
       <w:numFmt w:val="bullet"/>
@@ -11751,10 +11022,10 @@
       </w:rPr>
     </w:lvl>
   </w:abstractNum>
-  <w:abstractNum w:abstractNumId="4" w15:restartNumberingAfterBreak="0">
-    <w:nsid w:val="4318311B"/>
+  <w:abstractNum w:abstractNumId="1" w15:restartNumberingAfterBreak="0">
+    <w:nsid w:val="187B53B4"/>
     <w:multiLevelType w:val="multilevel"/>
-    <w:tmpl w:val="2C508784"/>
+    <w:tmpl w:val="EC480A64"/>
     <w:lvl w:ilvl="0">
       <w:start w:val="1"/>
       <w:numFmt w:val="bullet"/>
@@ -11864,10 +11135,10 @@
       </w:rPr>
     </w:lvl>
   </w:abstractNum>
-  <w:abstractNum w:abstractNumId="5" w15:restartNumberingAfterBreak="0">
-    <w:nsid w:val="503C4F83"/>
+  <w:abstractNum w:abstractNumId="2" w15:restartNumberingAfterBreak="0">
+    <w:nsid w:val="191A3985"/>
     <w:multiLevelType w:val="multilevel"/>
-    <w:tmpl w:val="3EF477A0"/>
+    <w:tmpl w:val="A22ACFBA"/>
     <w:lvl w:ilvl="0">
       <w:start w:val="1"/>
       <w:numFmt w:val="bullet"/>
@@ -11977,10 +11248,10 @@
       </w:rPr>
     </w:lvl>
   </w:abstractNum>
-  <w:abstractNum w:abstractNumId="6" w15:restartNumberingAfterBreak="0">
-    <w:nsid w:val="51C95188"/>
+  <w:abstractNum w:abstractNumId="3" w15:restartNumberingAfterBreak="0">
+    <w:nsid w:val="2BA50232"/>
     <w:multiLevelType w:val="multilevel"/>
-    <w:tmpl w:val="2EEA217C"/>
+    <w:tmpl w:val="E9FC24D6"/>
     <w:lvl w:ilvl="0">
       <w:start w:val="1"/>
       <w:numFmt w:val="bullet"/>
@@ -12090,10 +11361,10 @@
       </w:rPr>
     </w:lvl>
   </w:abstractNum>
-  <w:abstractNum w:abstractNumId="7" w15:restartNumberingAfterBreak="0">
-    <w:nsid w:val="5AD03268"/>
+  <w:abstractNum w:abstractNumId="4" w15:restartNumberingAfterBreak="0">
+    <w:nsid w:val="3DC04047"/>
     <w:multiLevelType w:val="multilevel"/>
-    <w:tmpl w:val="DE0AE9F2"/>
+    <w:tmpl w:val="581E0AD0"/>
     <w:lvl w:ilvl="0">
       <w:start w:val="1"/>
       <w:numFmt w:val="bullet"/>
@@ -12203,17 +11474,17 @@
       </w:rPr>
     </w:lvl>
   </w:abstractNum>
-  <w:abstractNum w:abstractNumId="8" w15:restartNumberingAfterBreak="0">
-    <w:nsid w:val="7B096085"/>
+  <w:abstractNum w:abstractNumId="5" w15:restartNumberingAfterBreak="0">
+    <w:nsid w:val="45E35A4B"/>
     <w:multiLevelType w:val="multilevel"/>
-    <w:tmpl w:val="3910A890"/>
+    <w:tmpl w:val="7F0EB152"/>
     <w:lvl w:ilvl="0">
       <w:start w:val="1"/>
       <w:numFmt w:val="bullet"/>
       <w:lvlText w:val="●"/>
       <w:lvlJc w:val="left"/>
       <w:pPr>
-        <w:ind w:left="2160" w:hanging="360"/>
+        <w:ind w:left="1080" w:hanging="360"/>
       </w:pPr>
       <w:rPr>
         <w:u w:val="none"/>
@@ -12225,7 +11496,7 @@
       <w:lvlText w:val="○"/>
       <w:lvlJc w:val="left"/>
       <w:pPr>
-        <w:ind w:left="2880" w:hanging="360"/>
+        <w:ind w:left="1800" w:hanging="360"/>
       </w:pPr>
       <w:rPr>
         <w:u w:val="none"/>
@@ -12237,7 +11508,7 @@
       <w:lvlText w:val="■"/>
       <w:lvlJc w:val="left"/>
       <w:pPr>
-        <w:ind w:left="3600" w:hanging="360"/>
+        <w:ind w:left="2520" w:hanging="360"/>
       </w:pPr>
       <w:rPr>
         <w:u w:val="none"/>
@@ -12249,7 +11520,7 @@
       <w:lvlText w:val="●"/>
       <w:lvlJc w:val="left"/>
       <w:pPr>
-        <w:ind w:left="4320" w:hanging="360"/>
+        <w:ind w:left="3240" w:hanging="360"/>
       </w:pPr>
       <w:rPr>
         <w:u w:val="none"/>
@@ -12261,7 +11532,7 @@
       <w:lvlText w:val="○"/>
       <w:lvlJc w:val="left"/>
       <w:pPr>
-        <w:ind w:left="5040" w:hanging="360"/>
+        <w:ind w:left="3960" w:hanging="360"/>
       </w:pPr>
       <w:rPr>
         <w:u w:val="none"/>
@@ -12273,7 +11544,7 @@
       <w:lvlText w:val="■"/>
       <w:lvlJc w:val="left"/>
       <w:pPr>
-        <w:ind w:left="5760" w:hanging="360"/>
+        <w:ind w:left="4680" w:hanging="360"/>
       </w:pPr>
       <w:rPr>
         <w:u w:val="none"/>
@@ -12285,7 +11556,7 @@
       <w:lvlText w:val="●"/>
       <w:lvlJc w:val="left"/>
       <w:pPr>
-        <w:ind w:left="6480" w:hanging="360"/>
+        <w:ind w:left="5400" w:hanging="360"/>
       </w:pPr>
       <w:rPr>
         <w:u w:val="none"/>
@@ -12297,7 +11568,7 @@
       <w:lvlText w:val="○"/>
       <w:lvlJc w:val="left"/>
       <w:pPr>
-        <w:ind w:left="7200" w:hanging="360"/>
+        <w:ind w:left="6120" w:hanging="360"/>
       </w:pPr>
       <w:rPr>
         <w:u w:val="none"/>
@@ -12309,6 +11580,345 @@
       <w:lvlText w:val="■"/>
       <w:lvlJc w:val="left"/>
       <w:pPr>
+        <w:ind w:left="6840" w:hanging="360"/>
+      </w:pPr>
+      <w:rPr>
+        <w:u w:val="none"/>
+      </w:rPr>
+    </w:lvl>
+  </w:abstractNum>
+  <w:abstractNum w:abstractNumId="6" w15:restartNumberingAfterBreak="0">
+    <w:nsid w:val="6784081F"/>
+    <w:multiLevelType w:val="multilevel"/>
+    <w:tmpl w:val="56D0C546"/>
+    <w:lvl w:ilvl="0">
+      <w:start w:val="1"/>
+      <w:numFmt w:val="bullet"/>
+      <w:lvlText w:val="●"/>
+      <w:lvlJc w:val="left"/>
+      <w:pPr>
+        <w:ind w:left="720" w:hanging="360"/>
+      </w:pPr>
+      <w:rPr>
+        <w:u w:val="none"/>
+      </w:rPr>
+    </w:lvl>
+    <w:lvl w:ilvl="1">
+      <w:start w:val="1"/>
+      <w:numFmt w:val="bullet"/>
+      <w:lvlText w:val="○"/>
+      <w:lvlJc w:val="left"/>
+      <w:pPr>
+        <w:ind w:left="1440" w:hanging="360"/>
+      </w:pPr>
+      <w:rPr>
+        <w:u w:val="none"/>
+      </w:rPr>
+    </w:lvl>
+    <w:lvl w:ilvl="2">
+      <w:start w:val="1"/>
+      <w:numFmt w:val="bullet"/>
+      <w:lvlText w:val="■"/>
+      <w:lvlJc w:val="left"/>
+      <w:pPr>
+        <w:ind w:left="2160" w:hanging="360"/>
+      </w:pPr>
+      <w:rPr>
+        <w:u w:val="none"/>
+      </w:rPr>
+    </w:lvl>
+    <w:lvl w:ilvl="3">
+      <w:start w:val="1"/>
+      <w:numFmt w:val="bullet"/>
+      <w:lvlText w:val="●"/>
+      <w:lvlJc w:val="left"/>
+      <w:pPr>
+        <w:ind w:left="2880" w:hanging="360"/>
+      </w:pPr>
+      <w:rPr>
+        <w:u w:val="none"/>
+      </w:rPr>
+    </w:lvl>
+    <w:lvl w:ilvl="4">
+      <w:start w:val="1"/>
+      <w:numFmt w:val="bullet"/>
+      <w:lvlText w:val="○"/>
+      <w:lvlJc w:val="left"/>
+      <w:pPr>
+        <w:ind w:left="3600" w:hanging="360"/>
+      </w:pPr>
+      <w:rPr>
+        <w:u w:val="none"/>
+      </w:rPr>
+    </w:lvl>
+    <w:lvl w:ilvl="5">
+      <w:start w:val="1"/>
+      <w:numFmt w:val="bullet"/>
+      <w:lvlText w:val="■"/>
+      <w:lvlJc w:val="left"/>
+      <w:pPr>
+        <w:ind w:left="4320" w:hanging="360"/>
+      </w:pPr>
+      <w:rPr>
+        <w:u w:val="none"/>
+      </w:rPr>
+    </w:lvl>
+    <w:lvl w:ilvl="6">
+      <w:start w:val="1"/>
+      <w:numFmt w:val="bullet"/>
+      <w:lvlText w:val="●"/>
+      <w:lvlJc w:val="left"/>
+      <w:pPr>
+        <w:ind w:left="5040" w:hanging="360"/>
+      </w:pPr>
+      <w:rPr>
+        <w:u w:val="none"/>
+      </w:rPr>
+    </w:lvl>
+    <w:lvl w:ilvl="7">
+      <w:start w:val="1"/>
+      <w:numFmt w:val="bullet"/>
+      <w:lvlText w:val="○"/>
+      <w:lvlJc w:val="left"/>
+      <w:pPr>
+        <w:ind w:left="5760" w:hanging="360"/>
+      </w:pPr>
+      <w:rPr>
+        <w:u w:val="none"/>
+      </w:rPr>
+    </w:lvl>
+    <w:lvl w:ilvl="8">
+      <w:start w:val="1"/>
+      <w:numFmt w:val="bullet"/>
+      <w:lvlText w:val="■"/>
+      <w:lvlJc w:val="left"/>
+      <w:pPr>
+        <w:ind w:left="6480" w:hanging="360"/>
+      </w:pPr>
+      <w:rPr>
+        <w:u w:val="none"/>
+      </w:rPr>
+    </w:lvl>
+  </w:abstractNum>
+  <w:abstractNum w:abstractNumId="7" w15:restartNumberingAfterBreak="0">
+    <w:nsid w:val="6D093AA6"/>
+    <w:multiLevelType w:val="multilevel"/>
+    <w:tmpl w:val="60201984"/>
+    <w:lvl w:ilvl="0">
+      <w:start w:val="1"/>
+      <w:numFmt w:val="bullet"/>
+      <w:lvlText w:val="●"/>
+      <w:lvlJc w:val="left"/>
+      <w:pPr>
+        <w:ind w:left="1080" w:hanging="360"/>
+      </w:pPr>
+      <w:rPr>
+        <w:u w:val="none"/>
+      </w:rPr>
+    </w:lvl>
+    <w:lvl w:ilvl="1">
+      <w:start w:val="1"/>
+      <w:numFmt w:val="bullet"/>
+      <w:lvlText w:val="○"/>
+      <w:lvlJc w:val="left"/>
+      <w:pPr>
+        <w:ind w:left="1800" w:hanging="360"/>
+      </w:pPr>
+      <w:rPr>
+        <w:u w:val="none"/>
+      </w:rPr>
+    </w:lvl>
+    <w:lvl w:ilvl="2">
+      <w:start w:val="1"/>
+      <w:numFmt w:val="bullet"/>
+      <w:lvlText w:val="■"/>
+      <w:lvlJc w:val="left"/>
+      <w:pPr>
+        <w:ind w:left="2520" w:hanging="360"/>
+      </w:pPr>
+      <w:rPr>
+        <w:u w:val="none"/>
+      </w:rPr>
+    </w:lvl>
+    <w:lvl w:ilvl="3">
+      <w:start w:val="1"/>
+      <w:numFmt w:val="bullet"/>
+      <w:lvlText w:val="●"/>
+      <w:lvlJc w:val="left"/>
+      <w:pPr>
+        <w:ind w:left="3240" w:hanging="360"/>
+      </w:pPr>
+      <w:rPr>
+        <w:u w:val="none"/>
+      </w:rPr>
+    </w:lvl>
+    <w:lvl w:ilvl="4">
+      <w:start w:val="1"/>
+      <w:numFmt w:val="bullet"/>
+      <w:lvlText w:val="○"/>
+      <w:lvlJc w:val="left"/>
+      <w:pPr>
+        <w:ind w:left="3960" w:hanging="360"/>
+      </w:pPr>
+      <w:rPr>
+        <w:u w:val="none"/>
+      </w:rPr>
+    </w:lvl>
+    <w:lvl w:ilvl="5">
+      <w:start w:val="1"/>
+      <w:numFmt w:val="bullet"/>
+      <w:lvlText w:val="■"/>
+      <w:lvlJc w:val="left"/>
+      <w:pPr>
+        <w:ind w:left="4680" w:hanging="360"/>
+      </w:pPr>
+      <w:rPr>
+        <w:u w:val="none"/>
+      </w:rPr>
+    </w:lvl>
+    <w:lvl w:ilvl="6">
+      <w:start w:val="1"/>
+      <w:numFmt w:val="bullet"/>
+      <w:lvlText w:val="●"/>
+      <w:lvlJc w:val="left"/>
+      <w:pPr>
+        <w:ind w:left="5400" w:hanging="360"/>
+      </w:pPr>
+      <w:rPr>
+        <w:u w:val="none"/>
+      </w:rPr>
+    </w:lvl>
+    <w:lvl w:ilvl="7">
+      <w:start w:val="1"/>
+      <w:numFmt w:val="bullet"/>
+      <w:lvlText w:val="○"/>
+      <w:lvlJc w:val="left"/>
+      <w:pPr>
+        <w:ind w:left="6120" w:hanging="360"/>
+      </w:pPr>
+      <w:rPr>
+        <w:u w:val="none"/>
+      </w:rPr>
+    </w:lvl>
+    <w:lvl w:ilvl="8">
+      <w:start w:val="1"/>
+      <w:numFmt w:val="bullet"/>
+      <w:lvlText w:val="■"/>
+      <w:lvlJc w:val="left"/>
+      <w:pPr>
+        <w:ind w:left="6840" w:hanging="360"/>
+      </w:pPr>
+      <w:rPr>
+        <w:u w:val="none"/>
+      </w:rPr>
+    </w:lvl>
+  </w:abstractNum>
+  <w:abstractNum w:abstractNumId="8" w15:restartNumberingAfterBreak="0">
+    <w:nsid w:val="6E53298F"/>
+    <w:multiLevelType w:val="multilevel"/>
+    <w:tmpl w:val="F50C91BE"/>
+    <w:lvl w:ilvl="0">
+      <w:start w:val="1"/>
+      <w:numFmt w:val="bullet"/>
+      <w:lvlText w:val="●"/>
+      <w:lvlJc w:val="left"/>
+      <w:pPr>
+        <w:ind w:left="2160" w:hanging="360"/>
+      </w:pPr>
+      <w:rPr>
+        <w:u w:val="none"/>
+      </w:rPr>
+    </w:lvl>
+    <w:lvl w:ilvl="1">
+      <w:start w:val="1"/>
+      <w:numFmt w:val="bullet"/>
+      <w:lvlText w:val="○"/>
+      <w:lvlJc w:val="left"/>
+      <w:pPr>
+        <w:ind w:left="2880" w:hanging="360"/>
+      </w:pPr>
+      <w:rPr>
+        <w:u w:val="none"/>
+      </w:rPr>
+    </w:lvl>
+    <w:lvl w:ilvl="2">
+      <w:start w:val="1"/>
+      <w:numFmt w:val="bullet"/>
+      <w:lvlText w:val="■"/>
+      <w:lvlJc w:val="left"/>
+      <w:pPr>
+        <w:ind w:left="3600" w:hanging="360"/>
+      </w:pPr>
+      <w:rPr>
+        <w:u w:val="none"/>
+      </w:rPr>
+    </w:lvl>
+    <w:lvl w:ilvl="3">
+      <w:start w:val="1"/>
+      <w:numFmt w:val="bullet"/>
+      <w:lvlText w:val="●"/>
+      <w:lvlJc w:val="left"/>
+      <w:pPr>
+        <w:ind w:left="4320" w:hanging="360"/>
+      </w:pPr>
+      <w:rPr>
+        <w:u w:val="none"/>
+      </w:rPr>
+    </w:lvl>
+    <w:lvl w:ilvl="4">
+      <w:start w:val="1"/>
+      <w:numFmt w:val="bullet"/>
+      <w:lvlText w:val="○"/>
+      <w:lvlJc w:val="left"/>
+      <w:pPr>
+        <w:ind w:left="5040" w:hanging="360"/>
+      </w:pPr>
+      <w:rPr>
+        <w:u w:val="none"/>
+      </w:rPr>
+    </w:lvl>
+    <w:lvl w:ilvl="5">
+      <w:start w:val="1"/>
+      <w:numFmt w:val="bullet"/>
+      <w:lvlText w:val="■"/>
+      <w:lvlJc w:val="left"/>
+      <w:pPr>
+        <w:ind w:left="5760" w:hanging="360"/>
+      </w:pPr>
+      <w:rPr>
+        <w:u w:val="none"/>
+      </w:rPr>
+    </w:lvl>
+    <w:lvl w:ilvl="6">
+      <w:start w:val="1"/>
+      <w:numFmt w:val="bullet"/>
+      <w:lvlText w:val="●"/>
+      <w:lvlJc w:val="left"/>
+      <w:pPr>
+        <w:ind w:left="6480" w:hanging="360"/>
+      </w:pPr>
+      <w:rPr>
+        <w:u w:val="none"/>
+      </w:rPr>
+    </w:lvl>
+    <w:lvl w:ilvl="7">
+      <w:start w:val="1"/>
+      <w:numFmt w:val="bullet"/>
+      <w:lvlText w:val="○"/>
+      <w:lvlJc w:val="left"/>
+      <w:pPr>
+        <w:ind w:left="7200" w:hanging="360"/>
+      </w:pPr>
+      <w:rPr>
+        <w:u w:val="none"/>
+      </w:rPr>
+    </w:lvl>
+    <w:lvl w:ilvl="8">
+      <w:start w:val="1"/>
+      <w:numFmt w:val="bullet"/>
+      <w:lvlText w:val="■"/>
+      <w:lvlJc w:val="left"/>
+      <w:pPr>
         <w:ind w:left="7920" w:hanging="360"/>
       </w:pPr>
       <w:rPr>
@@ -12317,31 +11927,31 @@
     </w:lvl>
   </w:abstractNum>
   <w:num w:numId="1">
+    <w:abstractNumId w:val="0"/>
+  </w:num>
+  <w:num w:numId="2">
+    <w:abstractNumId w:val="8"/>
+  </w:num>
+  <w:num w:numId="3">
+    <w:abstractNumId w:val="5"/>
+  </w:num>
+  <w:num w:numId="4">
+    <w:abstractNumId w:val="1"/>
+  </w:num>
+  <w:num w:numId="5">
+    <w:abstractNumId w:val="7"/>
+  </w:num>
+  <w:num w:numId="6">
     <w:abstractNumId w:val="3"/>
   </w:num>
-  <w:num w:numId="2">
-    <w:abstractNumId w:val="7"/>
-  </w:num>
-  <w:num w:numId="3">
+  <w:num w:numId="7">
     <w:abstractNumId w:val="4"/>
   </w:num>
-  <w:num w:numId="4">
+  <w:num w:numId="8">
     <w:abstractNumId w:val="2"/>
   </w:num>
-  <w:num w:numId="5">
-    <w:abstractNumId w:val="5"/>
-  </w:num>
-  <w:num w:numId="6">
+  <w:num w:numId="9">
     <w:abstractNumId w:val="6"/>
-  </w:num>
-  <w:num w:numId="7">
-    <w:abstractNumId w:val="8"/>
-  </w:num>
-  <w:num w:numId="8">
-    <w:abstractNumId w:val="1"/>
-  </w:num>
-  <w:num w:numId="9">
-    <w:abstractNumId w:val="0"/>
   </w:num>
 </w:numbering>
 </file>
@@ -13327,7 +12937,7 @@
 
 <file path=customXml/item1.xml><?xml version="1.0" encoding="utf-8"?>
 <go:gDocsCustomXmlDataStorage xmlns:go="http://customooxmlschemas.google.com/" xmlns:r="http://schemas.openxmlformats.org/officeDocument/2006/relationships" uri="GoogleDocsCustomDataVersion2">
-  <go:docsCustomData xmlns:go="http://customooxmlschemas.google.com/" roundtripDataSignature="AMtx7mgNzic4qRG3NE79ErveqyZOucdtqQ==">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</go:docsCustomData>
+  <go:docsCustomData xmlns:go="http://customooxmlschemas.google.com/" roundtripDataSignature="AMtx7mhEkz1EY6/D5oy5zsxLpUJ41DE4wA==">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</go:docsCustomData>
 </go:gDocsCustomXmlDataStorage>
 </file>
 

</xml_diff>